<commit_message>
Point docs and report at the new public repo DIU_Hackathon_final
</commit_message>
<xml_diff>
--- a/docs/Shurokkha_Project_Report.docx
+++ b/docs/Shurokkha_Project_Report.docx
@@ -495,7 +495,7 @@
                 <w:sz w:val="19"/>
                 <w:szCs w:val="19"/>
               </w:rPr>
-              <w:t>https://github.com/mohammadyaksafu/DIU_Hackathon</w:t>
+              <w:t>https://github.com/mohammadyaksafu/DIU_Hackathon_final</w:t>
             </w:r>
           </w:p>
         </w:tc>
@@ -655,7 +655,7 @@
     <w:sdt>
       <w:sdtPr>
         <w:alias w:val="Contents"/>
-        <w:id w:val="-538131165"/>
+        <w:id w:val="-965500792"/>
       </w:sdtPr>
       <w:sdtEndPr/>
       <w:sdtContent>
@@ -679,7 +679,7 @@
           <w:r>
             <w:fldChar w:fldCharType="separate"/>
           </w:r>
-          <w:hyperlink w:anchor="_Toc241958476" w:history="1">
+          <w:hyperlink w:anchor="_Toc241992983" w:history="1">
             <w:r>
               <w:rPr>
                 <w:rStyle w:val="Hyperlink"/>
@@ -703,7 +703,7 @@
               <w:rPr>
                 <w:noProof/>
               </w:rPr>
-              <w:instrText xml:space="preserve"> PAGEREF _Toc241958476 \h </w:instrText>
+              <w:instrText xml:space="preserve"> PAGEREF _Toc241992983 \h </w:instrText>
             </w:r>
             <w:r>
               <w:rPr>
@@ -741,7 +741,7 @@
               <w:noProof/>
             </w:rPr>
           </w:pPr>
-          <w:hyperlink w:anchor="_Toc241958477" w:history="1">
+          <w:hyperlink w:anchor="_Toc241992984" w:history="1">
             <w:r>
               <w:rPr>
                 <w:rStyle w:val="Hyperlink"/>
@@ -765,7 +765,7 @@
               <w:rPr>
                 <w:noProof/>
               </w:rPr>
-              <w:instrText xml:space="preserve"> PAGEREF _Toc241958477 \h </w:instrText>
+              <w:instrText xml:space="preserve"> PAGEREF _Toc241992984 \h </w:instrText>
             </w:r>
             <w:r>
               <w:rPr>
@@ -803,7 +803,7 @@
               <w:noProof/>
             </w:rPr>
           </w:pPr>
-          <w:hyperlink w:anchor="_Toc241958478" w:history="1">
+          <w:hyperlink w:anchor="_Toc241992985" w:history="1">
             <w:r>
               <w:rPr>
                 <w:rStyle w:val="Hyperlink"/>
@@ -827,7 +827,7 @@
               <w:rPr>
                 <w:noProof/>
               </w:rPr>
-              <w:instrText xml:space="preserve"> PAGEREF _Toc241958478 \h </w:instrText>
+              <w:instrText xml:space="preserve"> PAGEREF _Toc241992985 \h </w:instrText>
             </w:r>
             <w:r>
               <w:rPr>
@@ -865,7 +865,7 @@
               <w:noProof/>
             </w:rPr>
           </w:pPr>
-          <w:hyperlink w:anchor="_Toc241958479" w:history="1">
+          <w:hyperlink w:anchor="_Toc241992986" w:history="1">
             <w:r>
               <w:rPr>
                 <w:rStyle w:val="Hyperlink"/>
@@ -889,7 +889,7 @@
               <w:rPr>
                 <w:noProof/>
               </w:rPr>
-              <w:instrText xml:space="preserve"> PAGEREF _Toc241958479 \h </w:instrText>
+              <w:instrText xml:space="preserve"> PAGEREF _Toc241992986 \h </w:instrText>
             </w:r>
             <w:r>
               <w:rPr>
@@ -927,7 +927,7 @@
               <w:noProof/>
             </w:rPr>
           </w:pPr>
-          <w:hyperlink w:anchor="_Toc241958480" w:history="1">
+          <w:hyperlink w:anchor="_Toc241992987" w:history="1">
             <w:r>
               <w:rPr>
                 <w:rStyle w:val="Hyperlink"/>
@@ -951,7 +951,7 @@
               <w:rPr>
                 <w:noProof/>
               </w:rPr>
-              <w:instrText xml:space="preserve"> PAGEREF _Toc241958480 \h </w:instrText>
+              <w:instrText xml:space="preserve"> PAGEREF _Toc241992987 \h </w:instrText>
             </w:r>
             <w:r>
               <w:rPr>
@@ -989,7 +989,7 @@
               <w:noProof/>
             </w:rPr>
           </w:pPr>
-          <w:hyperlink w:anchor="_Toc241958481" w:history="1">
+          <w:hyperlink w:anchor="_Toc241992988" w:history="1">
             <w:r>
               <w:rPr>
                 <w:rStyle w:val="Hyperlink"/>
@@ -1013,7 +1013,7 @@
               <w:rPr>
                 <w:noProof/>
               </w:rPr>
-              <w:instrText xml:space="preserve"> PAGEREF _Toc241958481 \h </w:instrText>
+              <w:instrText xml:space="preserve"> PAGEREF _Toc241992988 \h </w:instrText>
             </w:r>
             <w:r>
               <w:rPr>
@@ -1051,7 +1051,7 @@
               <w:noProof/>
             </w:rPr>
           </w:pPr>
-          <w:hyperlink w:anchor="_Toc241958482" w:history="1">
+          <w:hyperlink w:anchor="_Toc241992989" w:history="1">
             <w:r>
               <w:rPr>
                 <w:rStyle w:val="Hyperlink"/>
@@ -1075,7 +1075,7 @@
               <w:rPr>
                 <w:noProof/>
               </w:rPr>
-              <w:instrText xml:space="preserve"> PAGEREF _Toc241958482 \h </w:instrText>
+              <w:instrText xml:space="preserve"> PAGEREF _Toc241992989 \h </w:instrText>
             </w:r>
             <w:r>
               <w:rPr>
@@ -1113,7 +1113,7 @@
               <w:noProof/>
             </w:rPr>
           </w:pPr>
-          <w:hyperlink w:anchor="_Toc241958483" w:history="1">
+          <w:hyperlink w:anchor="_Toc241992990" w:history="1">
             <w:r>
               <w:rPr>
                 <w:rStyle w:val="Hyperlink"/>
@@ -1137,7 +1137,7 @@
               <w:rPr>
                 <w:noProof/>
               </w:rPr>
-              <w:instrText xml:space="preserve"> PAGEREF _Toc241958483 \h </w:instrText>
+              <w:instrText xml:space="preserve"> PAGEREF _Toc241992990 \h </w:instrText>
             </w:r>
             <w:r>
               <w:rPr>
@@ -1175,7 +1175,7 @@
               <w:noProof/>
             </w:rPr>
           </w:pPr>
-          <w:hyperlink w:anchor="_Toc241958484" w:history="1">
+          <w:hyperlink w:anchor="_Toc241992991" w:history="1">
             <w:r>
               <w:rPr>
                 <w:rStyle w:val="Hyperlink"/>
@@ -1199,7 +1199,7 @@
               <w:rPr>
                 <w:noProof/>
               </w:rPr>
-              <w:instrText xml:space="preserve"> PAGEREF _Toc241958484 \h </w:instrText>
+              <w:instrText xml:space="preserve"> PAGEREF _Toc241992991 \h </w:instrText>
             </w:r>
             <w:r>
               <w:rPr>
@@ -1237,7 +1237,7 @@
               <w:noProof/>
             </w:rPr>
           </w:pPr>
-          <w:hyperlink w:anchor="_Toc241958485" w:history="1">
+          <w:hyperlink w:anchor="_Toc241992992" w:history="1">
             <w:r>
               <w:rPr>
                 <w:rStyle w:val="Hyperlink"/>
@@ -1261,7 +1261,7 @@
               <w:rPr>
                 <w:noProof/>
               </w:rPr>
-              <w:instrText xml:space="preserve"> PAGEREF _Toc241958485 \h </w:instrText>
+              <w:instrText xml:space="preserve"> PAGEREF _Toc241992992 \h </w:instrText>
             </w:r>
             <w:r>
               <w:rPr>
@@ -1299,7 +1299,7 @@
               <w:noProof/>
             </w:rPr>
           </w:pPr>
-          <w:hyperlink w:anchor="_Toc241958486" w:history="1">
+          <w:hyperlink w:anchor="_Toc241992993" w:history="1">
             <w:r>
               <w:rPr>
                 <w:rStyle w:val="Hyperlink"/>
@@ -1323,7 +1323,7 @@
               <w:rPr>
                 <w:noProof/>
               </w:rPr>
-              <w:instrText xml:space="preserve"> PAGEREF _Toc241958486 \h </w:instrText>
+              <w:instrText xml:space="preserve"> PAGEREF _Toc241992993 \h </w:instrText>
             </w:r>
             <w:r>
               <w:rPr>
@@ -1361,7 +1361,7 @@
               <w:noProof/>
             </w:rPr>
           </w:pPr>
-          <w:hyperlink w:anchor="_Toc241958487" w:history="1">
+          <w:hyperlink w:anchor="_Toc241992994" w:history="1">
             <w:r>
               <w:rPr>
                 <w:rStyle w:val="Hyperlink"/>
@@ -1385,7 +1385,7 @@
               <w:rPr>
                 <w:noProof/>
               </w:rPr>
-              <w:instrText xml:space="preserve"> PAGEREF _Toc241958487 \h </w:instrText>
+              <w:instrText xml:space="preserve"> PAGEREF _Toc241992994 \h </w:instrText>
             </w:r>
             <w:r>
               <w:rPr>
@@ -1423,7 +1423,7 @@
               <w:noProof/>
             </w:rPr>
           </w:pPr>
-          <w:hyperlink w:anchor="_Toc241958488" w:history="1">
+          <w:hyperlink w:anchor="_Toc241992995" w:history="1">
             <w:r>
               <w:rPr>
                 <w:rStyle w:val="Hyperlink"/>
@@ -1447,7 +1447,7 @@
               <w:rPr>
                 <w:noProof/>
               </w:rPr>
-              <w:instrText xml:space="preserve"> PAGEREF _Toc241958488 \h </w:instrText>
+              <w:instrText xml:space="preserve"> PAGEREF _Toc241992995 \h </w:instrText>
             </w:r>
             <w:r>
               <w:rPr>
@@ -1485,7 +1485,7 @@
               <w:noProof/>
             </w:rPr>
           </w:pPr>
-          <w:hyperlink w:anchor="_Toc241958489" w:history="1">
+          <w:hyperlink w:anchor="_Toc241992996" w:history="1">
             <w:r>
               <w:rPr>
                 <w:rStyle w:val="Hyperlink"/>
@@ -1509,7 +1509,7 @@
               <w:rPr>
                 <w:noProof/>
               </w:rPr>
-              <w:instrText xml:space="preserve"> PAGEREF _Toc241958489 \h </w:instrText>
+              <w:instrText xml:space="preserve"> PAGEREF _Toc241992996 \h </w:instrText>
             </w:r>
             <w:r>
               <w:rPr>
@@ -1547,7 +1547,7 @@
               <w:noProof/>
             </w:rPr>
           </w:pPr>
-          <w:hyperlink w:anchor="_Toc241958490" w:history="1">
+          <w:hyperlink w:anchor="_Toc241992997" w:history="1">
             <w:r>
               <w:rPr>
                 <w:rStyle w:val="Hyperlink"/>
@@ -1571,7 +1571,7 @@
               <w:rPr>
                 <w:noProof/>
               </w:rPr>
-              <w:instrText xml:space="preserve"> PAGEREF _Toc241958490 \h </w:instrText>
+              <w:instrText xml:space="preserve"> PAGEREF _Toc241992997 \h </w:instrText>
             </w:r>
             <w:r>
               <w:rPr>
@@ -1609,7 +1609,7 @@
               <w:noProof/>
             </w:rPr>
           </w:pPr>
-          <w:hyperlink w:anchor="_Toc241958491" w:history="1">
+          <w:hyperlink w:anchor="_Toc241992998" w:history="1">
             <w:r>
               <w:rPr>
                 <w:rStyle w:val="Hyperlink"/>
@@ -1633,7 +1633,7 @@
               <w:rPr>
                 <w:noProof/>
               </w:rPr>
-              <w:instrText xml:space="preserve"> PAGEREF _Toc241958491 \h </w:instrText>
+              <w:instrText xml:space="preserve"> PAGEREF _Toc241992998 \h </w:instrText>
             </w:r>
             <w:r>
               <w:rPr>
@@ -1671,7 +1671,7 @@
               <w:noProof/>
             </w:rPr>
           </w:pPr>
-          <w:hyperlink w:anchor="_Toc241958492" w:history="1">
+          <w:hyperlink w:anchor="_Toc241992999" w:history="1">
             <w:r>
               <w:rPr>
                 <w:rStyle w:val="Hyperlink"/>
@@ -1695,7 +1695,7 @@
               <w:rPr>
                 <w:noProof/>
               </w:rPr>
-              <w:instrText xml:space="preserve"> PAGEREF _Toc241958492 \h </w:instrText>
+              <w:instrText xml:space="preserve"> PAGEREF _Toc241992999 \h </w:instrText>
             </w:r>
             <w:r>
               <w:rPr>
@@ -1733,7 +1733,7 @@
               <w:noProof/>
             </w:rPr>
           </w:pPr>
-          <w:hyperlink w:anchor="_Toc241958493" w:history="1">
+          <w:hyperlink w:anchor="_Toc241993000" w:history="1">
             <w:r>
               <w:rPr>
                 <w:rStyle w:val="Hyperlink"/>
@@ -1757,7 +1757,7 @@
               <w:rPr>
                 <w:noProof/>
               </w:rPr>
-              <w:instrText xml:space="preserve"> PAGEREF _Toc241958493 \h </w:instrText>
+              <w:instrText xml:space="preserve"> PAGEREF _Toc241993000 \h </w:instrText>
             </w:r>
             <w:r>
               <w:rPr>
@@ -1795,7 +1795,7 @@
               <w:noProof/>
             </w:rPr>
           </w:pPr>
-          <w:hyperlink w:anchor="_Toc241958494" w:history="1">
+          <w:hyperlink w:anchor="_Toc241993001" w:history="1">
             <w:r>
               <w:rPr>
                 <w:rStyle w:val="Hyperlink"/>
@@ -1819,7 +1819,7 @@
               <w:rPr>
                 <w:noProof/>
               </w:rPr>
-              <w:instrText xml:space="preserve"> PAGEREF _Toc241958494 \h </w:instrText>
+              <w:instrText xml:space="preserve"> PAGEREF _Toc241993001 \h </w:instrText>
             </w:r>
             <w:r>
               <w:rPr>
@@ -1862,7 +1862,7 @@
       <w:pPr>
         <w:pStyle w:val="Heading1"/>
       </w:pPr>
-      <w:bookmarkStart w:id="1" w:name="_Toc241958476"/>
+      <w:bookmarkStart w:id="1" w:name="_Toc241992983"/>
       <w:r>
         <w:lastRenderedPageBreak/>
         <w:t>Abstract</w:t>
@@ -1988,7 +1988,7 @@
       <w:pPr>
         <w:pStyle w:val="Heading1"/>
       </w:pPr>
-      <w:bookmarkStart w:id="2" w:name="_Toc241958477"/>
+      <w:bookmarkStart w:id="2" w:name="_Toc241992984"/>
       <w:r>
         <w:t>1. Problem</w:t>
       </w:r>
@@ -2121,7 +2121,7 @@
       <w:pPr>
         <w:pStyle w:val="Heading1"/>
       </w:pPr>
-      <w:bookmarkStart w:id="3" w:name="_Toc241958478"/>
+      <w:bookmarkStart w:id="3" w:name="_Toc241992985"/>
       <w:r>
         <w:t>2. Proposed Idea</w:t>
       </w:r>
@@ -2483,7 +2483,7 @@
       <w:pPr>
         <w:pStyle w:val="Heading1"/>
       </w:pPr>
-      <w:bookmarkStart w:id="4" w:name="_Toc241958479"/>
+      <w:bookmarkStart w:id="4" w:name="_Toc241992986"/>
       <w:r>
         <w:t>3. Implemented Solution</w:t>
       </w:r>
@@ -2981,7 +2981,7 @@
       <w:pPr>
         <w:pStyle w:val="Heading2"/>
       </w:pPr>
-      <w:bookmarkStart w:id="5" w:name="_Toc241958480"/>
+      <w:bookmarkStart w:id="5" w:name="_Toc241992987"/>
       <w:r>
         <w:t>3.1 Architecture</w:t>
       </w:r>
@@ -3187,7 +3187,7 @@
       <w:pPr>
         <w:pStyle w:val="Heading2"/>
       </w:pPr>
-      <w:bookmarkStart w:id="6" w:name="_Toc241958481"/>
+      <w:bookmarkStart w:id="6" w:name="_Toc241992988"/>
       <w:r>
         <w:t>3.2 Technology stack</w:t>
       </w:r>
@@ -3658,7 +3658,7 @@
       <w:pPr>
         <w:pStyle w:val="Heading1"/>
       </w:pPr>
-      <w:bookmarkStart w:id="7" w:name="_Toc241958482"/>
+      <w:bookmarkStart w:id="7" w:name="_Toc241992989"/>
       <w:r>
         <w:t>4. Key Features</w:t>
       </w:r>
@@ -4581,7 +4581,7 @@
       <w:pPr>
         <w:pStyle w:val="Heading1"/>
       </w:pPr>
-      <w:bookmarkStart w:id="8" w:name="_Toc241958483"/>
+      <w:bookmarkStart w:id="8" w:name="_Toc241992990"/>
       <w:r>
         <w:t>5. AI Approach</w:t>
       </w:r>
@@ -4591,7 +4591,7 @@
       <w:pPr>
         <w:pStyle w:val="Heading2"/>
       </w:pPr>
-      <w:bookmarkStart w:id="9" w:name="_Toc241958484"/>
+      <w:bookmarkStart w:id="9" w:name="_Toc241992991"/>
       <w:r>
         <w:t>5.1 Data</w:t>
       </w:r>
@@ -4633,7 +4633,7 @@
       <w:pPr>
         <w:pStyle w:val="Heading2"/>
       </w:pPr>
-      <w:bookmarkStart w:id="10" w:name="_Toc241958485"/>
+      <w:bookmarkStart w:id="10" w:name="_Toc241992992"/>
       <w:r>
         <w:t>5.2 Features</w:t>
       </w:r>
@@ -4667,7 +4667,7 @@
       <w:pPr>
         <w:pStyle w:val="Heading2"/>
       </w:pPr>
-      <w:bookmarkStart w:id="11" w:name="_Toc241958486"/>
+      <w:bookmarkStart w:id="11" w:name="_Toc241992993"/>
       <w:r>
         <w:t>5.3 Models and decision policy</w:t>
       </w:r>
@@ -4795,7 +4795,7 @@
       <w:pPr>
         <w:pStyle w:val="Heading2"/>
       </w:pPr>
-      <w:bookmarkStart w:id="12" w:name="_Toc241958487"/>
+      <w:bookmarkStart w:id="12" w:name="_Toc241992994"/>
       <w:r>
         <w:t>5.4 Explainability</w:t>
       </w:r>
@@ -4826,7 +4826,7 @@
       <w:pPr>
         <w:pStyle w:val="Heading2"/>
       </w:pPr>
-      <w:bookmarkStart w:id="13" w:name="_Toc241958488"/>
+      <w:bookmarkStart w:id="13" w:name="_Toc241992995"/>
       <w:r>
         <w:t>5.5 Generative AI</w:t>
       </w:r>
@@ -4867,7 +4867,7 @@
       <w:pPr>
         <w:pStyle w:val="Heading2"/>
       </w:pPr>
-      <w:bookmarkStart w:id="14" w:name="_Toc241958489"/>
+      <w:bookmarkStart w:id="14" w:name="_Toc241992996"/>
       <w:r>
         <w:t>5.6 Evaluation</w:t>
       </w:r>
@@ -5934,7 +5934,7 @@
       <w:pPr>
         <w:pStyle w:val="Heading1"/>
       </w:pPr>
-      <w:bookmarkStart w:id="15" w:name="_Toc241958490"/>
+      <w:bookmarkStart w:id="15" w:name="_Toc241992997"/>
       <w:r>
         <w:t>6. Intended Real-Life Impact</w:t>
       </w:r>
@@ -6290,7 +6290,7 @@
       <w:pPr>
         <w:pStyle w:val="Heading2"/>
       </w:pPr>
-      <w:bookmarkStart w:id="16" w:name="_Toc241958491"/>
+      <w:bookmarkStart w:id="16" w:name="_Toc241992998"/>
       <w:r>
         <w:t xml:space="preserve">6.1 Integration </w:t>
       </w:r>
@@ -6334,7 +6334,7 @@
       <w:pPr>
         <w:pStyle w:val="Heading1"/>
       </w:pPr>
-      <w:bookmarkStart w:id="17" w:name="_Toc241958492"/>
+      <w:bookmarkStart w:id="17" w:name="_Toc241992999"/>
       <w:r>
         <w:t>7. Responsible AI and Security</w:t>
       </w:r>
@@ -6451,7 +6451,7 @@
       <w:pPr>
         <w:pStyle w:val="Heading1"/>
       </w:pPr>
-      <w:bookmarkStart w:id="18" w:name="_Toc241958493"/>
+      <w:bookmarkStart w:id="18" w:name="_Toc241993000"/>
       <w:r>
         <w:t>8. Limitations and Future Work</w:t>
       </w:r>
@@ -6521,7 +6521,7 @@
       <w:pPr>
         <w:pStyle w:val="Heading1"/>
       </w:pPr>
-      <w:bookmarkStart w:id="19" w:name="_Toc241958494"/>
+      <w:bookmarkStart w:id="19" w:name="_Toc241993001"/>
       <w:r>
         <w:t>9. Disclosures</w:t>
       </w:r>
@@ -6762,213 +6762,213 @@
 <file path=word/numbering.xml><?xml version="1.0" encoding="utf-8"?>
 <w:numbering xmlns:wpc="http://schemas.microsoft.com/office/word/2010/wordprocessingCanvas" xmlns:mc="http://schemas.openxmlformats.org/markup-compatibility/2006" xmlns:o="urn:schemas-microsoft-com:office:office" xmlns:r="http://schemas.openxmlformats.org/officeDocument/2006/relationships" xmlns:m="http://schemas.openxmlformats.org/officeDocument/2006/math" xmlns:v="urn:schemas-microsoft-com:vml" xmlns:wp14="http://schemas.microsoft.com/office/word/2010/wordprocessingDrawing" xmlns:wp="http://schemas.openxmlformats.org/drawingml/2006/wordprocessingDrawing" xmlns:w10="urn:schemas-microsoft-com:office:word" xmlns:w="http://schemas.openxmlformats.org/wordprocessingml/2006/main" xmlns:w14="http://schemas.microsoft.com/office/word/2010/wordml" xmlns:wpg="http://schemas.microsoft.com/office/word/2010/wordprocessingGroup" xmlns:wpi="http://schemas.microsoft.com/office/word/2010/wordprocessingInk" xmlns:wne="http://schemas.microsoft.com/office/word/2006/wordml" xmlns:wps="http://schemas.microsoft.com/office/word/2010/wordprocessingShape" mc:Ignorable="w14 wp14">
   <w:abstractNum w:abstractNumId="0">
-    <w:nsid w:val="190047FF"/>
+    <w:nsid w:val="3416736B"/>
     <w:multiLevelType w:val="hybridMultilevel"/>
-    <w:tmpl w:val="74F084D0"/>
-    <w:lvl w:ilvl="0" w:tplc="962450AA" w:tentative="1">
+    <w:tmpl w:val="3D3ED1D6"/>
+    <w:lvl w:ilvl="0" w:tplc="A10CDDE0">
       <w:start w:val="1"/>
       <w:numFmt w:val="bullet"/>
-      <w:lvlText w:val="●"/>
+      <w:lvlText w:val="•"/>
       <w:lvlJc w:val="left"/>
       <w:pPr>
-        <w:ind w:left="720" w:hanging="360"/>
+        <w:ind w:left="540" w:hanging="270"/>
       </w:pPr>
     </w:lvl>
-    <w:lvl w:ilvl="1" w:tplc="011848B6" w:tentative="1">
-      <w:start w:val="1"/>
-      <w:numFmt w:val="bullet"/>
-      <w:lvlText w:val="○"/>
-      <w:lvlJc w:val="left"/>
-      <w:pPr>
-        <w:ind w:left="1440" w:hanging="360"/>
-      </w:pPr>
-    </w:lvl>
-    <w:lvl w:ilvl="2" w:tplc="DFD227A2" w:tentative="1">
-      <w:start w:val="1"/>
-      <w:numFmt w:val="bullet"/>
-      <w:lvlText w:val="■"/>
-      <w:lvlJc w:val="left"/>
-      <w:pPr>
-        <w:ind w:left="2160" w:hanging="360"/>
-      </w:pPr>
-    </w:lvl>
-    <w:lvl w:ilvl="3" w:tplc="F5041D82" w:tentative="1">
-      <w:start w:val="1"/>
-      <w:numFmt w:val="bullet"/>
-      <w:lvlText w:val="●"/>
-      <w:lvlJc w:val="left"/>
-      <w:pPr>
-        <w:ind w:left="2880" w:hanging="360"/>
-      </w:pPr>
-    </w:lvl>
-    <w:lvl w:ilvl="4" w:tplc="5A1444F0" w:tentative="1">
-      <w:start w:val="1"/>
-      <w:numFmt w:val="bullet"/>
-      <w:lvlText w:val="○"/>
-      <w:lvlJc w:val="left"/>
-      <w:pPr>
-        <w:ind w:left="3600" w:hanging="360"/>
-      </w:pPr>
-    </w:lvl>
-    <w:lvl w:ilvl="5" w:tplc="0C7A0258" w:tentative="1">
-      <w:start w:val="1"/>
-      <w:numFmt w:val="bullet"/>
-      <w:lvlText w:val="■"/>
-      <w:lvlJc w:val="left"/>
-      <w:pPr>
-        <w:ind w:left="4320" w:hanging="360"/>
-      </w:pPr>
-    </w:lvl>
-    <w:lvl w:ilvl="6" w:tplc="52E8EB5C" w:tentative="1">
-      <w:start w:val="1"/>
-      <w:numFmt w:val="bullet"/>
-      <w:lvlText w:val="●"/>
-      <w:lvlJc w:val="left"/>
-      <w:pPr>
-        <w:ind w:left="5040" w:hanging="360"/>
-      </w:pPr>
-    </w:lvl>
-    <w:lvl w:ilvl="7" w:tplc="DFBE1C66" w:tentative="1">
-      <w:start w:val="1"/>
-      <w:numFmt w:val="bullet"/>
-      <w:lvlText w:val="●"/>
-      <w:lvlJc w:val="left"/>
-      <w:pPr>
-        <w:ind w:left="5760" w:hanging="360"/>
-      </w:pPr>
-    </w:lvl>
-    <w:lvl w:ilvl="8" w:tplc="C3E6D870" w:tentative="1">
-      <w:start w:val="1"/>
-      <w:numFmt w:val="bullet"/>
-      <w:lvlText w:val="●"/>
-      <w:lvlJc w:val="left"/>
-      <w:pPr>
-        <w:ind w:left="6480" w:hanging="360"/>
-      </w:pPr>
-    </w:lvl>
-  </w:abstractNum>
-  <w:abstractNum w:abstractNumId="1">
-    <w:nsid w:val="35315945"/>
-    <w:multiLevelType w:val="hybridMultilevel"/>
-    <w:tmpl w:val="03A2C6CA"/>
-    <w:lvl w:ilvl="0" w:tplc="E15AEBAC">
-      <w:start w:val="1"/>
-      <w:numFmt w:val="decimal"/>
-      <w:lvlText w:val="%1."/>
-      <w:lvlJc w:val="left"/>
-      <w:pPr>
-        <w:ind w:left="540" w:hanging="300"/>
-      </w:pPr>
-    </w:lvl>
-    <w:lvl w:ilvl="1" w:tplc="C2C2120A">
+    <w:lvl w:ilvl="1" w:tplc="9CC4A54E">
       <w:numFmt w:val="decimal"/>
       <w:lvlText w:val=""/>
       <w:lvlJc w:val="left"/>
     </w:lvl>
-    <w:lvl w:ilvl="2" w:tplc="592AF84A">
+    <w:lvl w:ilvl="2" w:tplc="141E1FF4">
       <w:numFmt w:val="decimal"/>
       <w:lvlText w:val=""/>
       <w:lvlJc w:val="left"/>
     </w:lvl>
-    <w:lvl w:ilvl="3" w:tplc="F3A6DC6E">
+    <w:lvl w:ilvl="3" w:tplc="346443C0">
       <w:numFmt w:val="decimal"/>
       <w:lvlText w:val=""/>
       <w:lvlJc w:val="left"/>
     </w:lvl>
-    <w:lvl w:ilvl="4" w:tplc="FC68CD7A">
+    <w:lvl w:ilvl="4" w:tplc="8D24381E">
       <w:numFmt w:val="decimal"/>
       <w:lvlText w:val=""/>
       <w:lvlJc w:val="left"/>
     </w:lvl>
-    <w:lvl w:ilvl="5" w:tplc="5EDC826A">
+    <w:lvl w:ilvl="5" w:tplc="4D56376E">
       <w:numFmt w:val="decimal"/>
       <w:lvlText w:val=""/>
       <w:lvlJc w:val="left"/>
     </w:lvl>
-    <w:lvl w:ilvl="6" w:tplc="96FA8A04">
+    <w:lvl w:ilvl="6" w:tplc="0014578C">
       <w:numFmt w:val="decimal"/>
       <w:lvlText w:val=""/>
       <w:lvlJc w:val="left"/>
     </w:lvl>
-    <w:lvl w:ilvl="7" w:tplc="679669AA">
+    <w:lvl w:ilvl="7" w:tplc="1BF4AF5A">
       <w:numFmt w:val="decimal"/>
       <w:lvlText w:val=""/>
       <w:lvlJc w:val="left"/>
     </w:lvl>
-    <w:lvl w:ilvl="8" w:tplc="FCB2DF92">
+    <w:lvl w:ilvl="8" w:tplc="926EFB72">
       <w:numFmt w:val="decimal"/>
       <w:lvlText w:val=""/>
       <w:lvlJc w:val="left"/>
     </w:lvl>
   </w:abstractNum>
-  <w:abstractNum w:abstractNumId="2">
-    <w:nsid w:val="7E8D4ADE"/>
+  <w:abstractNum w:abstractNumId="1">
+    <w:nsid w:val="5E802B68"/>
     <w:multiLevelType w:val="hybridMultilevel"/>
-    <w:tmpl w:val="D2D6FF7A"/>
-    <w:lvl w:ilvl="0" w:tplc="7F7C4C78">
+    <w:tmpl w:val="FF446C74"/>
+    <w:lvl w:ilvl="0" w:tplc="3536A4E0" w:tentative="1">
       <w:start w:val="1"/>
       <w:numFmt w:val="bullet"/>
-      <w:lvlText w:val="•"/>
+      <w:lvlText w:val="●"/>
       <w:lvlJc w:val="left"/>
       <w:pPr>
-        <w:ind w:left="540" w:hanging="270"/>
+        <w:ind w:left="720" w:hanging="360"/>
       </w:pPr>
     </w:lvl>
-    <w:lvl w:ilvl="1" w:tplc="2E2E0A6C">
+    <w:lvl w:ilvl="1" w:tplc="D33064A0" w:tentative="1">
+      <w:start w:val="1"/>
+      <w:numFmt w:val="bullet"/>
+      <w:lvlText w:val="○"/>
+      <w:lvlJc w:val="left"/>
+      <w:pPr>
+        <w:ind w:left="1440" w:hanging="360"/>
+      </w:pPr>
+    </w:lvl>
+    <w:lvl w:ilvl="2" w:tplc="AA96B64A" w:tentative="1">
+      <w:start w:val="1"/>
+      <w:numFmt w:val="bullet"/>
+      <w:lvlText w:val="■"/>
+      <w:lvlJc w:val="left"/>
+      <w:pPr>
+        <w:ind w:left="2160" w:hanging="360"/>
+      </w:pPr>
+    </w:lvl>
+    <w:lvl w:ilvl="3" w:tplc="DA72C8C6" w:tentative="1">
+      <w:start w:val="1"/>
+      <w:numFmt w:val="bullet"/>
+      <w:lvlText w:val="●"/>
+      <w:lvlJc w:val="left"/>
+      <w:pPr>
+        <w:ind w:left="2880" w:hanging="360"/>
+      </w:pPr>
+    </w:lvl>
+    <w:lvl w:ilvl="4" w:tplc="CEAACD46" w:tentative="1">
+      <w:start w:val="1"/>
+      <w:numFmt w:val="bullet"/>
+      <w:lvlText w:val="○"/>
+      <w:lvlJc w:val="left"/>
+      <w:pPr>
+        <w:ind w:left="3600" w:hanging="360"/>
+      </w:pPr>
+    </w:lvl>
+    <w:lvl w:ilvl="5" w:tplc="AA24D712" w:tentative="1">
+      <w:start w:val="1"/>
+      <w:numFmt w:val="bullet"/>
+      <w:lvlText w:val="■"/>
+      <w:lvlJc w:val="left"/>
+      <w:pPr>
+        <w:ind w:left="4320" w:hanging="360"/>
+      </w:pPr>
+    </w:lvl>
+    <w:lvl w:ilvl="6" w:tplc="7BF019E0" w:tentative="1">
+      <w:start w:val="1"/>
+      <w:numFmt w:val="bullet"/>
+      <w:lvlText w:val="●"/>
+      <w:lvlJc w:val="left"/>
+      <w:pPr>
+        <w:ind w:left="5040" w:hanging="360"/>
+      </w:pPr>
+    </w:lvl>
+    <w:lvl w:ilvl="7" w:tplc="F77611DE" w:tentative="1">
+      <w:start w:val="1"/>
+      <w:numFmt w:val="bullet"/>
+      <w:lvlText w:val="●"/>
+      <w:lvlJc w:val="left"/>
+      <w:pPr>
+        <w:ind w:left="5760" w:hanging="360"/>
+      </w:pPr>
+    </w:lvl>
+    <w:lvl w:ilvl="8" w:tplc="D4D6C3C2" w:tentative="1">
+      <w:start w:val="1"/>
+      <w:numFmt w:val="bullet"/>
+      <w:lvlText w:val="●"/>
+      <w:lvlJc w:val="left"/>
+      <w:pPr>
+        <w:ind w:left="6480" w:hanging="360"/>
+      </w:pPr>
+    </w:lvl>
+  </w:abstractNum>
+  <w:abstractNum w:abstractNumId="2">
+    <w:nsid w:val="6E1F5962"/>
+    <w:multiLevelType w:val="hybridMultilevel"/>
+    <w:tmpl w:val="C0925B08"/>
+    <w:lvl w:ilvl="0" w:tplc="B77A4A84">
+      <w:start w:val="1"/>
+      <w:numFmt w:val="decimal"/>
+      <w:lvlText w:val="%1."/>
+      <w:lvlJc w:val="left"/>
+      <w:pPr>
+        <w:ind w:left="540" w:hanging="300"/>
+      </w:pPr>
+    </w:lvl>
+    <w:lvl w:ilvl="1" w:tplc="30CEC55E">
       <w:numFmt w:val="decimal"/>
       <w:lvlText w:val=""/>
       <w:lvlJc w:val="left"/>
     </w:lvl>
-    <w:lvl w:ilvl="2" w:tplc="12D27AC0">
+    <w:lvl w:ilvl="2" w:tplc="3F201E78">
       <w:numFmt w:val="decimal"/>
       <w:lvlText w:val=""/>
       <w:lvlJc w:val="left"/>
     </w:lvl>
-    <w:lvl w:ilvl="3" w:tplc="76A881A0">
+    <w:lvl w:ilvl="3" w:tplc="54A6D6A4">
       <w:numFmt w:val="decimal"/>
       <w:lvlText w:val=""/>
       <w:lvlJc w:val="left"/>
     </w:lvl>
-    <w:lvl w:ilvl="4" w:tplc="402084F6">
+    <w:lvl w:ilvl="4" w:tplc="FDFEAE22">
       <w:numFmt w:val="decimal"/>
       <w:lvlText w:val=""/>
       <w:lvlJc w:val="left"/>
     </w:lvl>
-    <w:lvl w:ilvl="5" w:tplc="7040AA9C">
+    <w:lvl w:ilvl="5" w:tplc="FA7ABE70">
       <w:numFmt w:val="decimal"/>
       <w:lvlText w:val=""/>
       <w:lvlJc w:val="left"/>
     </w:lvl>
-    <w:lvl w:ilvl="6" w:tplc="C5BEB0F0">
+    <w:lvl w:ilvl="6" w:tplc="40600D40">
       <w:numFmt w:val="decimal"/>
       <w:lvlText w:val=""/>
       <w:lvlJc w:val="left"/>
     </w:lvl>
-    <w:lvl w:ilvl="7" w:tplc="91B0AC4A">
+    <w:lvl w:ilvl="7" w:tplc="9B1C0E70">
       <w:numFmt w:val="decimal"/>
       <w:lvlText w:val=""/>
       <w:lvlJc w:val="left"/>
     </w:lvl>
-    <w:lvl w:ilvl="8" w:tplc="16ECCB6C">
+    <w:lvl w:ilvl="8" w:tplc="35F8B91A">
       <w:numFmt w:val="decimal"/>
       <w:lvlText w:val=""/>
       <w:lvlJc w:val="left"/>
     </w:lvl>
   </w:abstractNum>
   <w:num w:numId="1">
+    <w:abstractNumId w:val="1"/>
+    <w:lvlOverride w:ilvl="0">
+      <w:startOverride w:val="1"/>
+    </w:lvlOverride>
+  </w:num>
+  <w:num w:numId="2">
     <w:abstractNumId w:val="0"/>
     <w:lvlOverride w:ilvl="0">
       <w:startOverride w:val="1"/>
     </w:lvlOverride>
   </w:num>
-  <w:num w:numId="2">
+  <w:num w:numId="3">
     <w:abstractNumId w:val="2"/>
-    <w:lvlOverride w:ilvl="0">
-      <w:startOverride w:val="1"/>
-    </w:lvlOverride>
-  </w:num>
-  <w:num w:numId="3">
-    <w:abstractNumId w:val="1"/>
     <w:lvlOverride w:ilvl="0">
       <w:startOverride w:val="1"/>
     </w:lvlOverride>
@@ -7352,7 +7352,7 @@
     <w:autoRedefine/>
     <w:uiPriority w:val="39"/>
     <w:unhideWhenUsed/>
-    <w:rsid w:val="00256A0B"/>
+    <w:rsid w:val="00E60B76"/>
     <w:pPr>
       <w:spacing w:after="100"/>
     </w:pPr>
@@ -7364,7 +7364,7 @@
     <w:autoRedefine/>
     <w:uiPriority w:val="39"/>
     <w:unhideWhenUsed/>
-    <w:rsid w:val="00256A0B"/>
+    <w:rsid w:val="00E60B76"/>
     <w:pPr>
       <w:spacing w:after="100"/>
       <w:ind w:left="220"/>
@@ -7749,7 +7749,7 @@
     <w:autoRedefine/>
     <w:uiPriority w:val="39"/>
     <w:unhideWhenUsed/>
-    <w:rsid w:val="00256A0B"/>
+    <w:rsid w:val="00E60B76"/>
     <w:pPr>
       <w:spacing w:after="100"/>
     </w:pPr>
@@ -7761,7 +7761,7 @@
     <w:autoRedefine/>
     <w:uiPriority w:val="39"/>
     <w:unhideWhenUsed/>
-    <w:rsid w:val="00256A0B"/>
+    <w:rsid w:val="00E60B76"/>
     <w:pPr>
       <w:spacing w:after="100"/>
       <w:ind w:left="220"/>

</xml_diff>

<commit_message>
Docs: live URLs, screenshots, robustness, updated report and evaluation
README: live demo links, screenshot gallery, robustness results, ADMIN_PASSWORD. Disclose Gemini. Update the project report (MD and Word) and model card. Add PROJECT_EVALUATION.md with the re-score. deploy/deploy.sh backs up, pulls, rebuilds and health-checks.
</commit_message>
<xml_diff>
--- a/docs/Shurokkha_Project_Report.docx
+++ b/docs/Shurokkha_Project_Report.docx
@@ -655,7 +655,7 @@
     <w:sdt>
       <w:sdtPr>
         <w:alias w:val="Contents"/>
-        <w:id w:val="-965500792"/>
+        <w:id w:val="-1074046517"/>
       </w:sdtPr>
       <w:sdtEndPr/>
       <w:sdtContent>
@@ -679,7 +679,7 @@
           <w:r>
             <w:fldChar w:fldCharType="separate"/>
           </w:r>
-          <w:hyperlink w:anchor="_Toc241992983" w:history="1">
+          <w:hyperlink w:anchor="_Toc242035564" w:history="1">
             <w:r>
               <w:rPr>
                 <w:rStyle w:val="Hyperlink"/>
@@ -703,7 +703,7 @@
               <w:rPr>
                 <w:noProof/>
               </w:rPr>
-              <w:instrText xml:space="preserve"> PAGEREF _Toc241992983 \h </w:instrText>
+              <w:instrText xml:space="preserve"> PAGEREF _Toc242035564 \h </w:instrText>
             </w:r>
             <w:r>
               <w:rPr>
@@ -741,7 +741,7 @@
               <w:noProof/>
             </w:rPr>
           </w:pPr>
-          <w:hyperlink w:anchor="_Toc241992984" w:history="1">
+          <w:hyperlink w:anchor="_Toc242035565" w:history="1">
             <w:r>
               <w:rPr>
                 <w:rStyle w:val="Hyperlink"/>
@@ -765,7 +765,7 @@
               <w:rPr>
                 <w:noProof/>
               </w:rPr>
-              <w:instrText xml:space="preserve"> PAGEREF _Toc241992984 \h </w:instrText>
+              <w:instrText xml:space="preserve"> PAGEREF _Toc242035565 \h </w:instrText>
             </w:r>
             <w:r>
               <w:rPr>
@@ -803,7 +803,7 @@
               <w:noProof/>
             </w:rPr>
           </w:pPr>
-          <w:hyperlink w:anchor="_Toc241992985" w:history="1">
+          <w:hyperlink w:anchor="_Toc242035566" w:history="1">
             <w:r>
               <w:rPr>
                 <w:rStyle w:val="Hyperlink"/>
@@ -827,7 +827,7 @@
               <w:rPr>
                 <w:noProof/>
               </w:rPr>
-              <w:instrText xml:space="preserve"> PAGEREF _Toc241992985 \h </w:instrText>
+              <w:instrText xml:space="preserve"> PAGEREF _Toc242035566 \h </w:instrText>
             </w:r>
             <w:r>
               <w:rPr>
@@ -865,7 +865,7 @@
               <w:noProof/>
             </w:rPr>
           </w:pPr>
-          <w:hyperlink w:anchor="_Toc241992986" w:history="1">
+          <w:hyperlink w:anchor="_Toc242035567" w:history="1">
             <w:r>
               <w:rPr>
                 <w:rStyle w:val="Hyperlink"/>
@@ -889,7 +889,7 @@
               <w:rPr>
                 <w:noProof/>
               </w:rPr>
-              <w:instrText xml:space="preserve"> PAGEREF _Toc241992986 \h </w:instrText>
+              <w:instrText xml:space="preserve"> PAGEREF _Toc242035567 \h </w:instrText>
             </w:r>
             <w:r>
               <w:rPr>
@@ -927,7 +927,7 @@
               <w:noProof/>
             </w:rPr>
           </w:pPr>
-          <w:hyperlink w:anchor="_Toc241992987" w:history="1">
+          <w:hyperlink w:anchor="_Toc242035568" w:history="1">
             <w:r>
               <w:rPr>
                 <w:rStyle w:val="Hyperlink"/>
@@ -951,7 +951,7 @@
               <w:rPr>
                 <w:noProof/>
               </w:rPr>
-              <w:instrText xml:space="preserve"> PAGEREF _Toc241992987 \h </w:instrText>
+              <w:instrText xml:space="preserve"> PAGEREF _Toc242035568 \h </w:instrText>
             </w:r>
             <w:r>
               <w:rPr>
@@ -989,7 +989,7 @@
               <w:noProof/>
             </w:rPr>
           </w:pPr>
-          <w:hyperlink w:anchor="_Toc241992988" w:history="1">
+          <w:hyperlink w:anchor="_Toc242035569" w:history="1">
             <w:r>
               <w:rPr>
                 <w:rStyle w:val="Hyperlink"/>
@@ -1013,7 +1013,7 @@
               <w:rPr>
                 <w:noProof/>
               </w:rPr>
-              <w:instrText xml:space="preserve"> PAGEREF _Toc241992988 \h </w:instrText>
+              <w:instrText xml:space="preserve"> PAGEREF _Toc242035569 \h </w:instrText>
             </w:r>
             <w:r>
               <w:rPr>
@@ -1051,7 +1051,7 @@
               <w:noProof/>
             </w:rPr>
           </w:pPr>
-          <w:hyperlink w:anchor="_Toc241992989" w:history="1">
+          <w:hyperlink w:anchor="_Toc242035570" w:history="1">
             <w:r>
               <w:rPr>
                 <w:rStyle w:val="Hyperlink"/>
@@ -1075,7 +1075,7 @@
               <w:rPr>
                 <w:noProof/>
               </w:rPr>
-              <w:instrText xml:space="preserve"> PAGEREF _Toc241992989 \h </w:instrText>
+              <w:instrText xml:space="preserve"> PAGEREF _Toc242035570 \h </w:instrText>
             </w:r>
             <w:r>
               <w:rPr>
@@ -1113,7 +1113,7 @@
               <w:noProof/>
             </w:rPr>
           </w:pPr>
-          <w:hyperlink w:anchor="_Toc241992990" w:history="1">
+          <w:hyperlink w:anchor="_Toc242035571" w:history="1">
             <w:r>
               <w:rPr>
                 <w:rStyle w:val="Hyperlink"/>
@@ -1137,7 +1137,7 @@
               <w:rPr>
                 <w:noProof/>
               </w:rPr>
-              <w:instrText xml:space="preserve"> PAGEREF _Toc241992990 \h </w:instrText>
+              <w:instrText xml:space="preserve"> PAGEREF _Toc242035571 \h </w:instrText>
             </w:r>
             <w:r>
               <w:rPr>
@@ -1175,7 +1175,7 @@
               <w:noProof/>
             </w:rPr>
           </w:pPr>
-          <w:hyperlink w:anchor="_Toc241992991" w:history="1">
+          <w:hyperlink w:anchor="_Toc242035572" w:history="1">
             <w:r>
               <w:rPr>
                 <w:rStyle w:val="Hyperlink"/>
@@ -1199,7 +1199,7 @@
               <w:rPr>
                 <w:noProof/>
               </w:rPr>
-              <w:instrText xml:space="preserve"> PAGEREF _Toc241992991 \h </w:instrText>
+              <w:instrText xml:space="preserve"> PAGEREF _Toc242035572 \h </w:instrText>
             </w:r>
             <w:r>
               <w:rPr>
@@ -1237,7 +1237,7 @@
               <w:noProof/>
             </w:rPr>
           </w:pPr>
-          <w:hyperlink w:anchor="_Toc241992992" w:history="1">
+          <w:hyperlink w:anchor="_Toc242035573" w:history="1">
             <w:r>
               <w:rPr>
                 <w:rStyle w:val="Hyperlink"/>
@@ -1261,7 +1261,7 @@
               <w:rPr>
                 <w:noProof/>
               </w:rPr>
-              <w:instrText xml:space="preserve"> PAGEREF _Toc241992992 \h </w:instrText>
+              <w:instrText xml:space="preserve"> PAGEREF _Toc242035573 \h </w:instrText>
             </w:r>
             <w:r>
               <w:rPr>
@@ -1299,7 +1299,7 @@
               <w:noProof/>
             </w:rPr>
           </w:pPr>
-          <w:hyperlink w:anchor="_Toc241992993" w:history="1">
+          <w:hyperlink w:anchor="_Toc242035574" w:history="1">
             <w:r>
               <w:rPr>
                 <w:rStyle w:val="Hyperlink"/>
@@ -1323,7 +1323,7 @@
               <w:rPr>
                 <w:noProof/>
               </w:rPr>
-              <w:instrText xml:space="preserve"> PAGEREF _Toc241992993 \h </w:instrText>
+              <w:instrText xml:space="preserve"> PAGEREF _Toc242035574 \h </w:instrText>
             </w:r>
             <w:r>
               <w:rPr>
@@ -1361,7 +1361,7 @@
               <w:noProof/>
             </w:rPr>
           </w:pPr>
-          <w:hyperlink w:anchor="_Toc241992994" w:history="1">
+          <w:hyperlink w:anchor="_Toc242035575" w:history="1">
             <w:r>
               <w:rPr>
                 <w:rStyle w:val="Hyperlink"/>
@@ -1385,7 +1385,7 @@
               <w:rPr>
                 <w:noProof/>
               </w:rPr>
-              <w:instrText xml:space="preserve"> PAGEREF _Toc241992994 \h </w:instrText>
+              <w:instrText xml:space="preserve"> PAGEREF _Toc242035575 \h </w:instrText>
             </w:r>
             <w:r>
               <w:rPr>
@@ -1423,7 +1423,7 @@
               <w:noProof/>
             </w:rPr>
           </w:pPr>
-          <w:hyperlink w:anchor="_Toc241992995" w:history="1">
+          <w:hyperlink w:anchor="_Toc242035576" w:history="1">
             <w:r>
               <w:rPr>
                 <w:rStyle w:val="Hyperlink"/>
@@ -1447,7 +1447,7 @@
               <w:rPr>
                 <w:noProof/>
               </w:rPr>
-              <w:instrText xml:space="preserve"> PAGEREF _Toc241992995 \h </w:instrText>
+              <w:instrText xml:space="preserve"> PAGEREF _Toc242035576 \h </w:instrText>
             </w:r>
             <w:r>
               <w:rPr>
@@ -1485,7 +1485,7 @@
               <w:noProof/>
             </w:rPr>
           </w:pPr>
-          <w:hyperlink w:anchor="_Toc241992996" w:history="1">
+          <w:hyperlink w:anchor="_Toc242035577" w:history="1">
             <w:r>
               <w:rPr>
                 <w:rStyle w:val="Hyperlink"/>
@@ -1509,7 +1509,7 @@
               <w:rPr>
                 <w:noProof/>
               </w:rPr>
-              <w:instrText xml:space="preserve"> PAGEREF _Toc241992996 \h </w:instrText>
+              <w:instrText xml:space="preserve"> PAGEREF _Toc242035577 \h </w:instrText>
             </w:r>
             <w:r>
               <w:rPr>
@@ -1527,6 +1527,130 @@
                 <w:noProof/>
               </w:rPr>
               <w:t>6</w:t>
+            </w:r>
+            <w:r>
+              <w:rPr>
+                <w:noProof/>
+              </w:rPr>
+              <w:fldChar w:fldCharType="end"/>
+            </w:r>
+          </w:hyperlink>
+        </w:p>
+        <w:p>
+          <w:pPr>
+            <w:pStyle w:val="TOC2"/>
+            <w:tabs>
+              <w:tab w:val="right" w:leader="dot" w:pos="9016"/>
+            </w:tabs>
+            <w:rPr>
+              <w:rFonts w:asciiTheme="minorHAnsi" w:eastAsiaTheme="minorEastAsia" w:hAnsiTheme="minorHAnsi" w:cstheme="minorBidi"/>
+              <w:noProof/>
+            </w:rPr>
+          </w:pPr>
+          <w:hyperlink w:anchor="_Toc242035578" w:history="1">
+            <w:r>
+              <w:rPr>
+                <w:rStyle w:val="Hyperlink"/>
+                <w:noProof/>
+              </w:rPr>
+              <w:t>5.7 Robustness: beyond the easy test</w:t>
+            </w:r>
+            <w:r>
+              <w:rPr>
+                <w:noProof/>
+              </w:rPr>
+              <w:tab/>
+            </w:r>
+            <w:r>
+              <w:rPr>
+                <w:noProof/>
+              </w:rPr>
+              <w:fldChar w:fldCharType="begin"/>
+            </w:r>
+            <w:r>
+              <w:rPr>
+                <w:noProof/>
+              </w:rPr>
+              <w:instrText xml:space="preserve"> PAGEREF _Toc242035578 \h </w:instrText>
+            </w:r>
+            <w:r>
+              <w:rPr>
+                <w:noProof/>
+              </w:rPr>
+            </w:r>
+            <w:r>
+              <w:rPr>
+                <w:noProof/>
+              </w:rPr>
+              <w:fldChar w:fldCharType="separate"/>
+            </w:r>
+            <w:r>
+              <w:rPr>
+                <w:noProof/>
+              </w:rPr>
+              <w:t>7</w:t>
+            </w:r>
+            <w:r>
+              <w:rPr>
+                <w:noProof/>
+              </w:rPr>
+              <w:fldChar w:fldCharType="end"/>
+            </w:r>
+          </w:hyperlink>
+        </w:p>
+        <w:p>
+          <w:pPr>
+            <w:pStyle w:val="TOC2"/>
+            <w:tabs>
+              <w:tab w:val="right" w:leader="dot" w:pos="9016"/>
+            </w:tabs>
+            <w:rPr>
+              <w:rFonts w:asciiTheme="minorHAnsi" w:eastAsiaTheme="minorEastAsia" w:hAnsiTheme="minorHAnsi" w:cstheme="minorBidi"/>
+              <w:noProof/>
+            </w:rPr>
+          </w:pPr>
+          <w:hyperlink w:anchor="_Toc242035579" w:history="1">
+            <w:r>
+              <w:rPr>
+                <w:rStyle w:val="Hyperlink"/>
+                <w:noProof/>
+              </w:rPr>
+              <w:t>5.8 Evaluating the generative AI</w:t>
+            </w:r>
+            <w:r>
+              <w:rPr>
+                <w:noProof/>
+              </w:rPr>
+              <w:tab/>
+            </w:r>
+            <w:r>
+              <w:rPr>
+                <w:noProof/>
+              </w:rPr>
+              <w:fldChar w:fldCharType="begin"/>
+            </w:r>
+            <w:r>
+              <w:rPr>
+                <w:noProof/>
+              </w:rPr>
+              <w:instrText xml:space="preserve"> PAGEREF _Toc242035579 \h </w:instrText>
+            </w:r>
+            <w:r>
+              <w:rPr>
+                <w:noProof/>
+              </w:rPr>
+            </w:r>
+            <w:r>
+              <w:rPr>
+                <w:noProof/>
+              </w:rPr>
+              <w:fldChar w:fldCharType="separate"/>
+            </w:r>
+            <w:r>
+              <w:rPr>
+                <w:noProof/>
+              </w:rPr>
+              <w:t>7</w:t>
             </w:r>
             <w:r>
               <w:rPr>
@@ -1547,7 +1671,7 @@
               <w:noProof/>
             </w:rPr>
           </w:pPr>
-          <w:hyperlink w:anchor="_Toc241992997" w:history="1">
+          <w:hyperlink w:anchor="_Toc242035580" w:history="1">
             <w:r>
               <w:rPr>
                 <w:rStyle w:val="Hyperlink"/>
@@ -1571,7 +1695,7 @@
               <w:rPr>
                 <w:noProof/>
               </w:rPr>
-              <w:instrText xml:space="preserve"> PAGEREF _Toc241992997 \h </w:instrText>
+              <w:instrText xml:space="preserve"> PAGEREF _Toc242035580 \h </w:instrText>
             </w:r>
             <w:r>
               <w:rPr>
@@ -1588,7 +1712,7 @@
               <w:rPr>
                 <w:noProof/>
               </w:rPr>
-              <w:t>7</w:t>
+              <w:t>8</w:t>
             </w:r>
             <w:r>
               <w:rPr>
@@ -1609,7 +1733,7 @@
               <w:noProof/>
             </w:rPr>
           </w:pPr>
-          <w:hyperlink w:anchor="_Toc241992998" w:history="1">
+          <w:hyperlink w:anchor="_Toc242035581" w:history="1">
             <w:r>
               <w:rPr>
                 <w:rStyle w:val="Hyperlink"/>
@@ -1633,7 +1757,7 @@
               <w:rPr>
                 <w:noProof/>
               </w:rPr>
-              <w:instrText xml:space="preserve"> PAGEREF _Toc241992998 \h </w:instrText>
+              <w:instrText xml:space="preserve"> PAGEREF _Toc242035581 \h </w:instrText>
             </w:r>
             <w:r>
               <w:rPr>
@@ -1650,7 +1774,7 @@
               <w:rPr>
                 <w:noProof/>
               </w:rPr>
-              <w:t>7</w:t>
+              <w:t>8</w:t>
             </w:r>
             <w:r>
               <w:rPr>
@@ -1671,7 +1795,7 @@
               <w:noProof/>
             </w:rPr>
           </w:pPr>
-          <w:hyperlink w:anchor="_Toc241992999" w:history="1">
+          <w:hyperlink w:anchor="_Toc242035582" w:history="1">
             <w:r>
               <w:rPr>
                 <w:rStyle w:val="Hyperlink"/>
@@ -1695,7 +1819,7 @@
               <w:rPr>
                 <w:noProof/>
               </w:rPr>
-              <w:instrText xml:space="preserve"> PAGEREF _Toc241992999 \h </w:instrText>
+              <w:instrText xml:space="preserve"> PAGEREF _Toc242035582 \h </w:instrText>
             </w:r>
             <w:r>
               <w:rPr>
@@ -1712,7 +1836,7 @@
               <w:rPr>
                 <w:noProof/>
               </w:rPr>
-              <w:t>7</w:t>
+              <w:t>8</w:t>
             </w:r>
             <w:r>
               <w:rPr>
@@ -1733,7 +1857,7 @@
               <w:noProof/>
             </w:rPr>
           </w:pPr>
-          <w:hyperlink w:anchor="_Toc241993000" w:history="1">
+          <w:hyperlink w:anchor="_Toc242035583" w:history="1">
             <w:r>
               <w:rPr>
                 <w:rStyle w:val="Hyperlink"/>
@@ -1757,7 +1881,7 @@
               <w:rPr>
                 <w:noProof/>
               </w:rPr>
-              <w:instrText xml:space="preserve"> PAGEREF _Toc241993000 \h </w:instrText>
+              <w:instrText xml:space="preserve"> PAGEREF _Toc242035583 \h </w:instrText>
             </w:r>
             <w:r>
               <w:rPr>
@@ -1774,7 +1898,7 @@
               <w:rPr>
                 <w:noProof/>
               </w:rPr>
-              <w:t>8</w:t>
+              <w:t>9</w:t>
             </w:r>
             <w:r>
               <w:rPr>
@@ -1795,7 +1919,7 @@
               <w:noProof/>
             </w:rPr>
           </w:pPr>
-          <w:hyperlink w:anchor="_Toc241993001" w:history="1">
+          <w:hyperlink w:anchor="_Toc242035584" w:history="1">
             <w:r>
               <w:rPr>
                 <w:rStyle w:val="Hyperlink"/>
@@ -1819,7 +1943,7 @@
               <w:rPr>
                 <w:noProof/>
               </w:rPr>
-              <w:instrText xml:space="preserve"> PAGEREF _Toc241993001 \h </w:instrText>
+              <w:instrText xml:space="preserve"> PAGEREF _Toc242035584 \h </w:instrText>
             </w:r>
             <w:r>
               <w:rPr>
@@ -1836,7 +1960,69 @@
               <w:rPr>
                 <w:noProof/>
               </w:rPr>
-              <w:t>8</w:t>
+              <w:t>9</w:t>
+            </w:r>
+            <w:r>
+              <w:rPr>
+                <w:noProof/>
+              </w:rPr>
+              <w:fldChar w:fldCharType="end"/>
+            </w:r>
+          </w:hyperlink>
+        </w:p>
+        <w:p>
+          <w:pPr>
+            <w:pStyle w:val="TOC1"/>
+            <w:tabs>
+              <w:tab w:val="right" w:leader="dot" w:pos="9016"/>
+            </w:tabs>
+            <w:rPr>
+              <w:rFonts w:asciiTheme="minorHAnsi" w:eastAsiaTheme="minorEastAsia" w:hAnsiTheme="minorHAnsi" w:cstheme="minorBidi"/>
+              <w:noProof/>
+            </w:rPr>
+          </w:pPr>
+          <w:hyperlink w:anchor="_Toc242035585" w:history="1">
+            <w:r>
+              <w:rPr>
+                <w:rStyle w:val="Hyperlink"/>
+                <w:noProof/>
+              </w:rPr>
+              <w:t>Appendix: Screenshots</w:t>
+            </w:r>
+            <w:r>
+              <w:rPr>
+                <w:noProof/>
+              </w:rPr>
+              <w:tab/>
+            </w:r>
+            <w:r>
+              <w:rPr>
+                <w:noProof/>
+              </w:rPr>
+              <w:fldChar w:fldCharType="begin"/>
+            </w:r>
+            <w:r>
+              <w:rPr>
+                <w:noProof/>
+              </w:rPr>
+              <w:instrText xml:space="preserve"> PAGEREF _Toc242035585 \h </w:instrText>
+            </w:r>
+            <w:r>
+              <w:rPr>
+                <w:noProof/>
+              </w:rPr>
+            </w:r>
+            <w:r>
+              <w:rPr>
+                <w:noProof/>
+              </w:rPr>
+              <w:fldChar w:fldCharType="separate"/>
+            </w:r>
+            <w:r>
+              <w:rPr>
+                <w:noProof/>
+              </w:rPr>
+              <w:t>10</w:t>
             </w:r>
             <w:r>
               <w:rPr>
@@ -1862,7 +2048,7 @@
       <w:pPr>
         <w:pStyle w:val="Heading1"/>
       </w:pPr>
-      <w:bookmarkStart w:id="1" w:name="_Toc241992983"/>
+      <w:bookmarkStart w:id="1" w:name="_Toc242035564"/>
       <w:r>
         <w:lastRenderedPageBreak/>
         <w:t>Abstract</w:t>
@@ -1988,7 +2174,7 @@
       <w:pPr>
         <w:pStyle w:val="Heading1"/>
       </w:pPr>
-      <w:bookmarkStart w:id="2" w:name="_Toc241992984"/>
+      <w:bookmarkStart w:id="2" w:name="_Toc242035565"/>
       <w:r>
         <w:t>1. Problem</w:t>
       </w:r>
@@ -2121,7 +2307,7 @@
       <w:pPr>
         <w:pStyle w:val="Heading1"/>
       </w:pPr>
-      <w:bookmarkStart w:id="3" w:name="_Toc241992985"/>
+      <w:bookmarkStart w:id="3" w:name="_Toc242035566"/>
       <w:r>
         <w:t>2. Proposed Idea</w:t>
       </w:r>
@@ -2483,7 +2669,7 @@
       <w:pPr>
         <w:pStyle w:val="Heading1"/>
       </w:pPr>
-      <w:bookmarkStart w:id="4" w:name="_Toc241992986"/>
+      <w:bookmarkStart w:id="4" w:name="_Toc242035567"/>
       <w:r>
         <w:t>3. Implemented Solution</w:t>
       </w:r>
@@ -2981,7 +3167,7 @@
       <w:pPr>
         <w:pStyle w:val="Heading2"/>
       </w:pPr>
-      <w:bookmarkStart w:id="5" w:name="_Toc241992987"/>
+      <w:bookmarkStart w:id="5" w:name="_Toc242035568"/>
       <w:r>
         <w:t>3.1 Architecture</w:t>
       </w:r>
@@ -3187,7 +3373,7 @@
       <w:pPr>
         <w:pStyle w:val="Heading2"/>
       </w:pPr>
-      <w:bookmarkStart w:id="6" w:name="_Toc241992988"/>
+      <w:bookmarkStart w:id="6" w:name="_Toc242035569"/>
       <w:r>
         <w:t>3.2 Technology stack</w:t>
       </w:r>
@@ -3658,7 +3844,7 @@
       <w:pPr>
         <w:pStyle w:val="Heading1"/>
       </w:pPr>
-      <w:bookmarkStart w:id="7" w:name="_Toc241992989"/>
+      <w:bookmarkStart w:id="7" w:name="_Toc242035570"/>
       <w:r>
         <w:t>4. Key Features</w:t>
       </w:r>
@@ -4581,7 +4767,7 @@
       <w:pPr>
         <w:pStyle w:val="Heading1"/>
       </w:pPr>
-      <w:bookmarkStart w:id="8" w:name="_Toc241992990"/>
+      <w:bookmarkStart w:id="8" w:name="_Toc242035571"/>
       <w:r>
         <w:t>5. AI Approach</w:t>
       </w:r>
@@ -4591,7 +4777,7 @@
       <w:pPr>
         <w:pStyle w:val="Heading2"/>
       </w:pPr>
-      <w:bookmarkStart w:id="9" w:name="_Toc241992991"/>
+      <w:bookmarkStart w:id="9" w:name="_Toc242035572"/>
       <w:r>
         <w:t>5.1 Data</w:t>
       </w:r>
@@ -4633,7 +4819,7 @@
       <w:pPr>
         <w:pStyle w:val="Heading2"/>
       </w:pPr>
-      <w:bookmarkStart w:id="10" w:name="_Toc241992992"/>
+      <w:bookmarkStart w:id="10" w:name="_Toc242035573"/>
       <w:r>
         <w:t>5.2 Features</w:t>
       </w:r>
@@ -4667,7 +4853,7 @@
       <w:pPr>
         <w:pStyle w:val="Heading2"/>
       </w:pPr>
-      <w:bookmarkStart w:id="11" w:name="_Toc241992993"/>
+      <w:bookmarkStart w:id="11" w:name="_Toc242035574"/>
       <w:r>
         <w:t>5.3 Models and decision policy</w:t>
       </w:r>
@@ -4795,7 +4981,7 @@
       <w:pPr>
         <w:pStyle w:val="Heading2"/>
       </w:pPr>
-      <w:bookmarkStart w:id="12" w:name="_Toc241992994"/>
+      <w:bookmarkStart w:id="12" w:name="_Toc242035575"/>
       <w:r>
         <w:t>5.4 Explainability</w:t>
       </w:r>
@@ -4826,7 +5012,7 @@
       <w:pPr>
         <w:pStyle w:val="Heading2"/>
       </w:pPr>
-      <w:bookmarkStart w:id="13" w:name="_Toc241992995"/>
+      <w:bookmarkStart w:id="13" w:name="_Toc242035576"/>
       <w:r>
         <w:t>5.5 Generative AI</w:t>
       </w:r>
@@ -4867,7 +5053,7 @@
       <w:pPr>
         <w:pStyle w:val="Heading2"/>
       </w:pPr>
-      <w:bookmarkStart w:id="14" w:name="_Toc241992996"/>
+      <w:bookmarkStart w:id="14" w:name="_Toc242035577"/>
       <w:r>
         <w:t>5.6 Evaluation</w:t>
       </w:r>
@@ -5932,13 +6118,1164 @@
     </w:p>
     <w:p>
       <w:pPr>
+        <w:pStyle w:val="Heading2"/>
+      </w:pPr>
+      <w:bookmarkStart w:id="15" w:name="_Toc242035578"/>
+      <w:r>
+        <w:t>5.7 Robustness: beyond the easy test</w:t>
+      </w:r>
+      <w:bookmarkEnd w:id="15"/>
+    </w:p>
+    <w:p>
+      <w:pPr>
+        <w:spacing w:after="120" w:line="288" w:lineRule="auto"/>
+      </w:pPr>
+      <w:r>
+        <w:t>Synthetic fraud is easier than real fraud, so the headline numbers above are an upper bound. We therefore also test what happens when the model meets something it has never seen (backend/pipelines/robustness.py, same time-based split, 1% false-positive ope</w:t>
+      </w:r>
+      <w:r>
+        <w:t>rating point, ML model alone):</w:t>
+      </w:r>
+    </w:p>
+    <w:tbl>
+      <w:tblPr>
+        <w:tblW w:w="9026" w:type="dxa"/>
+        <w:tblInd w:w="110" w:type="dxa"/>
+        <w:tblBorders>
+          <w:top w:val="single" w:sz="4" w:space="0" w:color="auto"/>
+          <w:left w:val="single" w:sz="4" w:space="0" w:color="auto"/>
+          <w:bottom w:val="single" w:sz="4" w:space="0" w:color="auto"/>
+          <w:right w:val="single" w:sz="4" w:space="0" w:color="auto"/>
+          <w:insideH w:val="single" w:sz="4" w:space="0" w:color="auto"/>
+          <w:insideV w:val="single" w:sz="4" w:space="0" w:color="auto"/>
+        </w:tblBorders>
+        <w:tblCellMar>
+          <w:left w:w="10" w:type="dxa"/>
+          <w:right w:w="10" w:type="dxa"/>
+        </w:tblCellMar>
+        <w:tblLook w:val="04A0" w:firstRow="1" w:lastRow="0" w:firstColumn="1" w:lastColumn="0" w:noHBand="0" w:noVBand="1"/>
+      </w:tblPr>
+      <w:tblGrid>
+        <w:gridCol w:w="4026"/>
+        <w:gridCol w:w="2500"/>
+        <w:gridCol w:w="2500"/>
+      </w:tblGrid>
+      <w:tr>
+        <w:tblPrEx>
+          <w:tblCellMar>
+            <w:top w:w="0" w:type="dxa"/>
+            <w:bottom w:w="0" w:type="dxa"/>
+          </w:tblCellMar>
+        </w:tblPrEx>
+        <w:trPr>
+          <w:tblHeader/>
+        </w:trPr>
+        <w:tc>
+          <w:tcPr>
+            <w:tcW w:w="4026" w:type="dxa"/>
+            <w:tcBorders>
+              <w:top w:val="single" w:sz="4" w:space="0" w:color="C9C8C0"/>
+              <w:left w:val="single" w:sz="4" w:space="0" w:color="C9C8C0"/>
+              <w:bottom w:val="single" w:sz="4" w:space="0" w:color="C9C8C0"/>
+              <w:right w:val="single" w:sz="4" w:space="0" w:color="C9C8C0"/>
+            </w:tcBorders>
+            <w:shd w:val="clear" w:color="auto" w:fill="0F6B5C"/>
+            <w:tcMar>
+              <w:top w:w="70" w:type="dxa"/>
+              <w:left w:w="110" w:type="dxa"/>
+              <w:bottom w:w="70" w:type="dxa"/>
+              <w:right w:w="110" w:type="dxa"/>
+            </w:tcMar>
+          </w:tcPr>
+          <w:p>
+            <w:r>
+              <w:rPr>
+                <w:b/>
+                <w:bCs/>
+                <w:color w:val="FFFFFF"/>
+                <w:sz w:val="19"/>
+                <w:szCs w:val="19"/>
+              </w:rPr>
+              <w:t>Fraud family</w:t>
+            </w:r>
+          </w:p>
+        </w:tc>
+        <w:tc>
+          <w:tcPr>
+            <w:tcW w:w="2500" w:type="dxa"/>
+            <w:tcBorders>
+              <w:top w:val="single" w:sz="4" w:space="0" w:color="C9C8C0"/>
+              <w:left w:val="single" w:sz="4" w:space="0" w:color="C9C8C0"/>
+              <w:bottom w:val="single" w:sz="4" w:space="0" w:color="C9C8C0"/>
+              <w:right w:val="single" w:sz="4" w:space="0" w:color="C9C8C0"/>
+            </w:tcBorders>
+            <w:shd w:val="clear" w:color="auto" w:fill="0F6B5C"/>
+            <w:tcMar>
+              <w:top w:w="70" w:type="dxa"/>
+              <w:left w:w="110" w:type="dxa"/>
+              <w:bottom w:w="70" w:type="dxa"/>
+              <w:right w:w="110" w:type="dxa"/>
+            </w:tcMar>
+          </w:tcPr>
+          <w:p>
+            <w:r>
+              <w:rPr>
+                <w:b/>
+                <w:bCs/>
+                <w:color w:val="FFFFFF"/>
+                <w:sz w:val="19"/>
+                <w:szCs w:val="19"/>
+              </w:rPr>
+              <w:t>Recall when seen in training</w:t>
+            </w:r>
+          </w:p>
+        </w:tc>
+        <w:tc>
+          <w:tcPr>
+            <w:tcW w:w="2500" w:type="dxa"/>
+            <w:tcBorders>
+              <w:top w:val="single" w:sz="4" w:space="0" w:color="C9C8C0"/>
+              <w:left w:val="single" w:sz="4" w:space="0" w:color="C9C8C0"/>
+              <w:bottom w:val="single" w:sz="4" w:space="0" w:color="C9C8C0"/>
+              <w:right w:val="single" w:sz="4" w:space="0" w:color="C9C8C0"/>
+            </w:tcBorders>
+            <w:shd w:val="clear" w:color="auto" w:fill="0F6B5C"/>
+            <w:tcMar>
+              <w:top w:w="70" w:type="dxa"/>
+              <w:left w:w="110" w:type="dxa"/>
+              <w:bottom w:w="70" w:type="dxa"/>
+              <w:right w:w="110" w:type="dxa"/>
+            </w:tcMar>
+          </w:tcPr>
+          <w:p>
+            <w:r>
+              <w:rPr>
+                <w:b/>
+                <w:bCs/>
+                <w:color w:val="FFFFFF"/>
+                <w:sz w:val="19"/>
+                <w:szCs w:val="19"/>
+              </w:rPr>
+              <w:t>Recall when never seen</w:t>
+            </w:r>
+          </w:p>
+        </w:tc>
+      </w:tr>
+      <w:tr>
+        <w:tblPrEx>
+          <w:tblCellMar>
+            <w:top w:w="0" w:type="dxa"/>
+            <w:bottom w:w="0" w:type="dxa"/>
+          </w:tblCellMar>
+        </w:tblPrEx>
+        <w:tc>
+          <w:tcPr>
+            <w:tcW w:w="4026" w:type="dxa"/>
+            <w:tcBorders>
+              <w:top w:val="single" w:sz="4" w:space="0" w:color="C9C8C0"/>
+              <w:left w:val="single" w:sz="4" w:space="0" w:color="C9C8C0"/>
+              <w:bottom w:val="single" w:sz="4" w:space="0" w:color="C9C8C0"/>
+              <w:right w:val="single" w:sz="4" w:space="0" w:color="C9C8C0"/>
+            </w:tcBorders>
+            <w:tcMar>
+              <w:top w:w="70" w:type="dxa"/>
+              <w:left w:w="110" w:type="dxa"/>
+              <w:bottom w:w="70" w:type="dxa"/>
+              <w:right w:w="110" w:type="dxa"/>
+            </w:tcMar>
+          </w:tcPr>
+          <w:p>
+            <w:r>
+              <w:rPr>
+                <w:sz w:val="19"/>
+                <w:szCs w:val="19"/>
+              </w:rPr>
+              <w:t>Account takeover</w:t>
+            </w:r>
+          </w:p>
+        </w:tc>
+        <w:tc>
+          <w:tcPr>
+            <w:tcW w:w="2500" w:type="dxa"/>
+            <w:tcBorders>
+              <w:top w:val="single" w:sz="4" w:space="0" w:color="C9C8C0"/>
+              <w:left w:val="single" w:sz="4" w:space="0" w:color="C9C8C0"/>
+              <w:bottom w:val="single" w:sz="4" w:space="0" w:color="C9C8C0"/>
+              <w:right w:val="single" w:sz="4" w:space="0" w:color="C9C8C0"/>
+            </w:tcBorders>
+            <w:tcMar>
+              <w:top w:w="70" w:type="dxa"/>
+              <w:left w:w="110" w:type="dxa"/>
+              <w:bottom w:w="70" w:type="dxa"/>
+              <w:right w:w="110" w:type="dxa"/>
+            </w:tcMar>
+          </w:tcPr>
+          <w:p>
+            <w:r>
+              <w:rPr>
+                <w:sz w:val="19"/>
+                <w:szCs w:val="19"/>
+              </w:rPr>
+              <w:t>100%</w:t>
+            </w:r>
+          </w:p>
+        </w:tc>
+        <w:tc>
+          <w:tcPr>
+            <w:tcW w:w="2500" w:type="dxa"/>
+            <w:tcBorders>
+              <w:top w:val="single" w:sz="4" w:space="0" w:color="C9C8C0"/>
+              <w:left w:val="single" w:sz="4" w:space="0" w:color="C9C8C0"/>
+              <w:bottom w:val="single" w:sz="4" w:space="0" w:color="C9C8C0"/>
+              <w:right w:val="single" w:sz="4" w:space="0" w:color="C9C8C0"/>
+            </w:tcBorders>
+            <w:tcMar>
+              <w:top w:w="70" w:type="dxa"/>
+              <w:left w:w="110" w:type="dxa"/>
+              <w:bottom w:w="70" w:type="dxa"/>
+              <w:right w:w="110" w:type="dxa"/>
+            </w:tcMar>
+          </w:tcPr>
+          <w:p>
+            <w:r>
+              <w:rPr>
+                <w:sz w:val="19"/>
+                <w:szCs w:val="19"/>
+              </w:rPr>
+              <w:t>87%</w:t>
+            </w:r>
+          </w:p>
+        </w:tc>
+      </w:tr>
+      <w:tr>
+        <w:tblPrEx>
+          <w:tblCellMar>
+            <w:top w:w="0" w:type="dxa"/>
+            <w:bottom w:w="0" w:type="dxa"/>
+          </w:tblCellMar>
+        </w:tblPrEx>
+        <w:tc>
+          <w:tcPr>
+            <w:tcW w:w="4026" w:type="dxa"/>
+            <w:tcBorders>
+              <w:top w:val="single" w:sz="4" w:space="0" w:color="C9C8C0"/>
+              <w:left w:val="single" w:sz="4" w:space="0" w:color="C9C8C0"/>
+              <w:bottom w:val="single" w:sz="4" w:space="0" w:color="C9C8C0"/>
+              <w:right w:val="single" w:sz="4" w:space="0" w:color="C9C8C0"/>
+            </w:tcBorders>
+            <w:tcMar>
+              <w:top w:w="70" w:type="dxa"/>
+              <w:left w:w="110" w:type="dxa"/>
+              <w:bottom w:w="70" w:type="dxa"/>
+              <w:right w:w="110" w:type="dxa"/>
+            </w:tcMar>
+          </w:tcPr>
+          <w:p>
+            <w:r>
+              <w:rPr>
+                <w:sz w:val="19"/>
+                <w:szCs w:val="19"/>
+              </w:rPr>
+              <w:t>Prize scam</w:t>
+            </w:r>
+          </w:p>
+        </w:tc>
+        <w:tc>
+          <w:tcPr>
+            <w:tcW w:w="2500" w:type="dxa"/>
+            <w:tcBorders>
+              <w:top w:val="single" w:sz="4" w:space="0" w:color="C9C8C0"/>
+              <w:left w:val="single" w:sz="4" w:space="0" w:color="C9C8C0"/>
+              <w:bottom w:val="single" w:sz="4" w:space="0" w:color="C9C8C0"/>
+              <w:right w:val="single" w:sz="4" w:space="0" w:color="C9C8C0"/>
+            </w:tcBorders>
+            <w:tcMar>
+              <w:top w:w="70" w:type="dxa"/>
+              <w:left w:w="110" w:type="dxa"/>
+              <w:bottom w:w="70" w:type="dxa"/>
+              <w:right w:w="110" w:type="dxa"/>
+            </w:tcMar>
+          </w:tcPr>
+          <w:p>
+            <w:r>
+              <w:rPr>
+                <w:sz w:val="19"/>
+                <w:szCs w:val="19"/>
+              </w:rPr>
+              <w:t>97%</w:t>
+            </w:r>
+          </w:p>
+        </w:tc>
+        <w:tc>
+          <w:tcPr>
+            <w:tcW w:w="2500" w:type="dxa"/>
+            <w:tcBorders>
+              <w:top w:val="single" w:sz="4" w:space="0" w:color="C9C8C0"/>
+              <w:left w:val="single" w:sz="4" w:space="0" w:color="C9C8C0"/>
+              <w:bottom w:val="single" w:sz="4" w:space="0" w:color="C9C8C0"/>
+              <w:right w:val="single" w:sz="4" w:space="0" w:color="C9C8C0"/>
+            </w:tcBorders>
+            <w:tcMar>
+              <w:top w:w="70" w:type="dxa"/>
+              <w:left w:w="110" w:type="dxa"/>
+              <w:bottom w:w="70" w:type="dxa"/>
+              <w:right w:w="110" w:type="dxa"/>
+            </w:tcMar>
+          </w:tcPr>
+          <w:p>
+            <w:r>
+              <w:rPr>
+                <w:sz w:val="19"/>
+                <w:szCs w:val="19"/>
+              </w:rPr>
+              <w:t>85%</w:t>
+            </w:r>
+          </w:p>
+        </w:tc>
+      </w:tr>
+      <w:tr>
+        <w:tblPrEx>
+          <w:tblCellMar>
+            <w:top w:w="0" w:type="dxa"/>
+            <w:bottom w:w="0" w:type="dxa"/>
+          </w:tblCellMar>
+        </w:tblPrEx>
+        <w:tc>
+          <w:tcPr>
+            <w:tcW w:w="4026" w:type="dxa"/>
+            <w:tcBorders>
+              <w:top w:val="single" w:sz="4" w:space="0" w:color="C9C8C0"/>
+              <w:left w:val="single" w:sz="4" w:space="0" w:color="C9C8C0"/>
+              <w:bottom w:val="single" w:sz="4" w:space="0" w:color="C9C8C0"/>
+              <w:right w:val="single" w:sz="4" w:space="0" w:color="C9C8C0"/>
+            </w:tcBorders>
+            <w:tcMar>
+              <w:top w:w="70" w:type="dxa"/>
+              <w:left w:w="110" w:type="dxa"/>
+              <w:bottom w:w="70" w:type="dxa"/>
+              <w:right w:w="110" w:type="dxa"/>
+            </w:tcMar>
+          </w:tcPr>
+          <w:p>
+            <w:r>
+              <w:rPr>
+                <w:sz w:val="19"/>
+                <w:szCs w:val="19"/>
+              </w:rPr>
+              <w:t>Refund scam</w:t>
+            </w:r>
+          </w:p>
+        </w:tc>
+        <w:tc>
+          <w:tcPr>
+            <w:tcW w:w="2500" w:type="dxa"/>
+            <w:tcBorders>
+              <w:top w:val="single" w:sz="4" w:space="0" w:color="C9C8C0"/>
+              <w:left w:val="single" w:sz="4" w:space="0" w:color="C9C8C0"/>
+              <w:bottom w:val="single" w:sz="4" w:space="0" w:color="C9C8C0"/>
+              <w:right w:val="single" w:sz="4" w:space="0" w:color="C9C8C0"/>
+            </w:tcBorders>
+            <w:tcMar>
+              <w:top w:w="70" w:type="dxa"/>
+              <w:left w:w="110" w:type="dxa"/>
+              <w:bottom w:w="70" w:type="dxa"/>
+              <w:right w:w="110" w:type="dxa"/>
+            </w:tcMar>
+          </w:tcPr>
+          <w:p>
+            <w:r>
+              <w:rPr>
+                <w:sz w:val="19"/>
+                <w:szCs w:val="19"/>
+              </w:rPr>
+              <w:t>100%</w:t>
+            </w:r>
+          </w:p>
+        </w:tc>
+        <w:tc>
+          <w:tcPr>
+            <w:tcW w:w="2500" w:type="dxa"/>
+            <w:tcBorders>
+              <w:top w:val="single" w:sz="4" w:space="0" w:color="C9C8C0"/>
+              <w:left w:val="single" w:sz="4" w:space="0" w:color="C9C8C0"/>
+              <w:bottom w:val="single" w:sz="4" w:space="0" w:color="C9C8C0"/>
+              <w:right w:val="single" w:sz="4" w:space="0" w:color="C9C8C0"/>
+            </w:tcBorders>
+            <w:tcMar>
+              <w:top w:w="70" w:type="dxa"/>
+              <w:left w:w="110" w:type="dxa"/>
+              <w:bottom w:w="70" w:type="dxa"/>
+              <w:right w:w="110" w:type="dxa"/>
+            </w:tcMar>
+          </w:tcPr>
+          <w:p>
+            <w:r>
+              <w:rPr>
+                <w:sz w:val="19"/>
+                <w:szCs w:val="19"/>
+              </w:rPr>
+              <w:t>76%</w:t>
+            </w:r>
+          </w:p>
+        </w:tc>
+      </w:tr>
+      <w:tr>
+        <w:tblPrEx>
+          <w:tblCellMar>
+            <w:top w:w="0" w:type="dxa"/>
+            <w:bottom w:w="0" w:type="dxa"/>
+          </w:tblCellMar>
+        </w:tblPrEx>
+        <w:tc>
+          <w:tcPr>
+            <w:tcW w:w="4026" w:type="dxa"/>
+            <w:tcBorders>
+              <w:top w:val="single" w:sz="4" w:space="0" w:color="C9C8C0"/>
+              <w:left w:val="single" w:sz="4" w:space="0" w:color="C9C8C0"/>
+              <w:bottom w:val="single" w:sz="4" w:space="0" w:color="C9C8C0"/>
+              <w:right w:val="single" w:sz="4" w:space="0" w:color="C9C8C0"/>
+            </w:tcBorders>
+            <w:tcMar>
+              <w:top w:w="70" w:type="dxa"/>
+              <w:left w:w="110" w:type="dxa"/>
+              <w:bottom w:w="70" w:type="dxa"/>
+              <w:right w:w="110" w:type="dxa"/>
+            </w:tcMar>
+          </w:tcPr>
+          <w:p>
+            <w:r>
+              <w:rPr>
+                <w:sz w:val="19"/>
+                <w:szCs w:val="19"/>
+              </w:rPr>
+              <w:t>Social engineering</w:t>
+            </w:r>
+          </w:p>
+        </w:tc>
+        <w:tc>
+          <w:tcPr>
+            <w:tcW w:w="2500" w:type="dxa"/>
+            <w:tcBorders>
+              <w:top w:val="single" w:sz="4" w:space="0" w:color="C9C8C0"/>
+              <w:left w:val="single" w:sz="4" w:space="0" w:color="C9C8C0"/>
+              <w:bottom w:val="single" w:sz="4" w:space="0" w:color="C9C8C0"/>
+              <w:right w:val="single" w:sz="4" w:space="0" w:color="C9C8C0"/>
+            </w:tcBorders>
+            <w:tcMar>
+              <w:top w:w="70" w:type="dxa"/>
+              <w:left w:w="110" w:type="dxa"/>
+              <w:bottom w:w="70" w:type="dxa"/>
+              <w:right w:w="110" w:type="dxa"/>
+            </w:tcMar>
+          </w:tcPr>
+          <w:p>
+            <w:r>
+              <w:rPr>
+                <w:sz w:val="19"/>
+                <w:szCs w:val="19"/>
+              </w:rPr>
+              <w:t>97%</w:t>
+            </w:r>
+          </w:p>
+        </w:tc>
+        <w:tc>
+          <w:tcPr>
+            <w:tcW w:w="2500" w:type="dxa"/>
+            <w:tcBorders>
+              <w:top w:val="single" w:sz="4" w:space="0" w:color="C9C8C0"/>
+              <w:left w:val="single" w:sz="4" w:space="0" w:color="C9C8C0"/>
+              <w:bottom w:val="single" w:sz="4" w:space="0" w:color="C9C8C0"/>
+              <w:right w:val="single" w:sz="4" w:space="0" w:color="C9C8C0"/>
+            </w:tcBorders>
+            <w:tcMar>
+              <w:top w:w="70" w:type="dxa"/>
+              <w:left w:w="110" w:type="dxa"/>
+              <w:bottom w:w="70" w:type="dxa"/>
+              <w:right w:w="110" w:type="dxa"/>
+            </w:tcMar>
+          </w:tcPr>
+          <w:p>
+            <w:r>
+              <w:rPr>
+                <w:sz w:val="19"/>
+                <w:szCs w:val="19"/>
+              </w:rPr>
+              <w:t>97%</w:t>
+            </w:r>
+          </w:p>
+        </w:tc>
+      </w:tr>
+      <w:tr>
+        <w:tblPrEx>
+          <w:tblCellMar>
+            <w:top w:w="0" w:type="dxa"/>
+            <w:bottom w:w="0" w:type="dxa"/>
+          </w:tblCellMar>
+        </w:tblPrEx>
+        <w:tc>
+          <w:tcPr>
+            <w:tcW w:w="4026" w:type="dxa"/>
+            <w:tcBorders>
+              <w:top w:val="single" w:sz="4" w:space="0" w:color="C9C8C0"/>
+              <w:left w:val="single" w:sz="4" w:space="0" w:color="C9C8C0"/>
+              <w:bottom w:val="single" w:sz="4" w:space="0" w:color="C9C8C0"/>
+              <w:right w:val="single" w:sz="4" w:space="0" w:color="C9C8C0"/>
+            </w:tcBorders>
+            <w:tcMar>
+              <w:top w:w="70" w:type="dxa"/>
+              <w:left w:w="110" w:type="dxa"/>
+              <w:bottom w:w="70" w:type="dxa"/>
+              <w:right w:w="110" w:type="dxa"/>
+            </w:tcMar>
+          </w:tcPr>
+          <w:p>
+            <w:r>
+              <w:rPr>
+                <w:sz w:val="19"/>
+                <w:szCs w:val="19"/>
+              </w:rPr>
+              <w:t>Mule network</w:t>
+            </w:r>
+          </w:p>
+        </w:tc>
+        <w:tc>
+          <w:tcPr>
+            <w:tcW w:w="2500" w:type="dxa"/>
+            <w:tcBorders>
+              <w:top w:val="single" w:sz="4" w:space="0" w:color="C9C8C0"/>
+              <w:left w:val="single" w:sz="4" w:space="0" w:color="C9C8C0"/>
+              <w:bottom w:val="single" w:sz="4" w:space="0" w:color="C9C8C0"/>
+              <w:right w:val="single" w:sz="4" w:space="0" w:color="C9C8C0"/>
+            </w:tcBorders>
+            <w:tcMar>
+              <w:top w:w="70" w:type="dxa"/>
+              <w:left w:w="110" w:type="dxa"/>
+              <w:bottom w:w="70" w:type="dxa"/>
+              <w:right w:w="110" w:type="dxa"/>
+            </w:tcMar>
+          </w:tcPr>
+          <w:p>
+            <w:r>
+              <w:rPr>
+                <w:sz w:val="19"/>
+                <w:szCs w:val="19"/>
+              </w:rPr>
+              <w:t>100%</w:t>
+            </w:r>
+          </w:p>
+        </w:tc>
+        <w:tc>
+          <w:tcPr>
+            <w:tcW w:w="2500" w:type="dxa"/>
+            <w:tcBorders>
+              <w:top w:val="single" w:sz="4" w:space="0" w:color="C9C8C0"/>
+              <w:left w:val="single" w:sz="4" w:space="0" w:color="C9C8C0"/>
+              <w:bottom w:val="single" w:sz="4" w:space="0" w:color="C9C8C0"/>
+              <w:right w:val="single" w:sz="4" w:space="0" w:color="C9C8C0"/>
+            </w:tcBorders>
+            <w:tcMar>
+              <w:top w:w="70" w:type="dxa"/>
+              <w:left w:w="110" w:type="dxa"/>
+              <w:bottom w:w="70" w:type="dxa"/>
+              <w:right w:w="110" w:type="dxa"/>
+            </w:tcMar>
+          </w:tcPr>
+          <w:p>
+            <w:r>
+              <w:rPr>
+                <w:sz w:val="19"/>
+                <w:szCs w:val="19"/>
+              </w:rPr>
+              <w:t>47%</w:t>
+            </w:r>
+          </w:p>
+        </w:tc>
+      </w:tr>
+      <w:tr>
+        <w:tblPrEx>
+          <w:tblCellMar>
+            <w:top w:w="0" w:type="dxa"/>
+            <w:bottom w:w="0" w:type="dxa"/>
+          </w:tblCellMar>
+        </w:tblPrEx>
+        <w:tc>
+          <w:tcPr>
+            <w:tcW w:w="4026" w:type="dxa"/>
+            <w:tcBorders>
+              <w:top w:val="single" w:sz="4" w:space="0" w:color="C9C8C0"/>
+              <w:left w:val="single" w:sz="4" w:space="0" w:color="C9C8C0"/>
+              <w:bottom w:val="single" w:sz="4" w:space="0" w:color="C9C8C0"/>
+              <w:right w:val="single" w:sz="4" w:space="0" w:color="C9C8C0"/>
+            </w:tcBorders>
+            <w:tcMar>
+              <w:top w:w="70" w:type="dxa"/>
+              <w:left w:w="110" w:type="dxa"/>
+              <w:bottom w:w="70" w:type="dxa"/>
+              <w:right w:w="110" w:type="dxa"/>
+            </w:tcMar>
+          </w:tcPr>
+          <w:p>
+            <w:r>
+              <w:rPr>
+                <w:sz w:val="19"/>
+                <w:szCs w:val="19"/>
+              </w:rPr>
+              <w:t>Structuring</w:t>
+            </w:r>
+          </w:p>
+        </w:tc>
+        <w:tc>
+          <w:tcPr>
+            <w:tcW w:w="2500" w:type="dxa"/>
+            <w:tcBorders>
+              <w:top w:val="single" w:sz="4" w:space="0" w:color="C9C8C0"/>
+              <w:left w:val="single" w:sz="4" w:space="0" w:color="C9C8C0"/>
+              <w:bottom w:val="single" w:sz="4" w:space="0" w:color="C9C8C0"/>
+              <w:right w:val="single" w:sz="4" w:space="0" w:color="C9C8C0"/>
+            </w:tcBorders>
+            <w:tcMar>
+              <w:top w:w="70" w:type="dxa"/>
+              <w:left w:w="110" w:type="dxa"/>
+              <w:bottom w:w="70" w:type="dxa"/>
+              <w:right w:w="110" w:type="dxa"/>
+            </w:tcMar>
+          </w:tcPr>
+          <w:p>
+            <w:r>
+              <w:rPr>
+                <w:sz w:val="19"/>
+                <w:szCs w:val="19"/>
+              </w:rPr>
+              <w:t>100%</w:t>
+            </w:r>
+          </w:p>
+        </w:tc>
+        <w:tc>
+          <w:tcPr>
+            <w:tcW w:w="2500" w:type="dxa"/>
+            <w:tcBorders>
+              <w:top w:val="single" w:sz="4" w:space="0" w:color="C9C8C0"/>
+              <w:left w:val="single" w:sz="4" w:space="0" w:color="C9C8C0"/>
+              <w:bottom w:val="single" w:sz="4" w:space="0" w:color="C9C8C0"/>
+              <w:right w:val="single" w:sz="4" w:space="0" w:color="C9C8C0"/>
+            </w:tcBorders>
+            <w:tcMar>
+              <w:top w:w="70" w:type="dxa"/>
+              <w:left w:w="110" w:type="dxa"/>
+              <w:bottom w:w="70" w:type="dxa"/>
+              <w:right w:w="110" w:type="dxa"/>
+            </w:tcMar>
+          </w:tcPr>
+          <w:p>
+            <w:r>
+              <w:rPr>
+                <w:sz w:val="19"/>
+                <w:szCs w:val="19"/>
+              </w:rPr>
+              <w:t>0%</w:t>
+            </w:r>
+          </w:p>
+        </w:tc>
+      </w:tr>
+    </w:tbl>
+    <w:p>
+      <w:pPr>
+        <w:spacing w:before="60" w:after="200"/>
+      </w:pPr>
+      <w:r>
+        <w:rPr>
+          <w:i/>
+          <w:iCs/>
+          <w:color w:val="52514E"/>
+          <w:sz w:val="18"/>
+          <w:szCs w:val="18"/>
+        </w:rPr>
+        <w:t>Table: leave-one-scenario-out. The model is retrained without one fraud family and tested on it.</w:t>
+      </w:r>
+    </w:p>
+    <w:p>
+      <w:pPr>
+        <w:spacing w:after="120" w:line="288" w:lineRule="auto"/>
+      </w:pPr>
+      <w:r>
+        <w:t>Most scam types are still caught even when the model was never trained on them. New mule networks and new structuring patterns are the weak spots; in the deplo</w:t>
+      </w:r>
+      <w:r>
+        <w:t xml:space="preserve">yed system the deterministic rules (near-limit cash-outs, SIM-swap plus PIN-reset combination) and the graph detector cover these. When a mule ring is brand new and has no graph history, recall falls only from 99% to </w:t>
+      </w:r>
+      <w:r>
+        <w:rPr>
+          <w:b/>
+          <w:bCs/>
+        </w:rPr>
+        <w:t>94%</w:t>
+      </w:r>
+      <w:r>
+        <w:t xml:space="preserve"> (PR-AUC 0.995 to 0.958), because li</w:t>
+      </w:r>
+      <w:r>
+        <w:t>ve behaviour features carry most of the signal.</w:t>
+      </w:r>
+    </w:p>
+    <w:p>
+      <w:pPr>
+        <w:spacing w:after="120" w:line="288" w:lineRule="auto"/>
+      </w:pPr>
+      <w:r>
+        <w:rPr>
+          <w:b/>
+          <w:bCs/>
+        </w:rPr>
+        <w:t>Calibration.</w:t>
+      </w:r>
+      <w:r>
+        <w:t xml:space="preserve"> Expected calibration error is 0.0024. Mid-range scores are conservative: transfers the model scored between 0.25 and 0.50 were fraud 96% of the time. This is why a transfer showing a fraud probab</w:t>
+      </w:r>
+      <w:r>
+        <w:t>ility of about 38% is correctly held, and why the app shows a risk level measured against the policy thresholds rather than the raw number alone.</w:t>
+      </w:r>
+    </w:p>
+    <w:p>
+      <w:pPr>
+        <w:pStyle w:val="Heading2"/>
+      </w:pPr>
+      <w:bookmarkStart w:id="16" w:name="_Toc242035579"/>
+      <w:r>
+        <w:t>5.8 Evaluating the generative AI</w:t>
+      </w:r>
+      <w:bookmarkEnd w:id="16"/>
+    </w:p>
+    <w:p>
+      <w:pPr>
+        <w:spacing w:after="120" w:line="288" w:lineRule="auto"/>
+      </w:pPr>
+      <w:r>
+        <w:t>An automated harness (backend/pipelines/genai_eval.py) checks every AI case s</w:t>
+      </w:r>
+      <w:r>
+        <w:t>ummary against its evidence. On 20 alerts (10 HOLD, 10 WARN):</w:t>
+      </w:r>
+    </w:p>
+    <w:tbl>
+      <w:tblPr>
+        <w:tblW w:w="9026" w:type="dxa"/>
+        <w:tblInd w:w="110" w:type="dxa"/>
+        <w:tblBorders>
+          <w:top w:val="single" w:sz="4" w:space="0" w:color="auto"/>
+          <w:left w:val="single" w:sz="4" w:space="0" w:color="auto"/>
+          <w:bottom w:val="single" w:sz="4" w:space="0" w:color="auto"/>
+          <w:right w:val="single" w:sz="4" w:space="0" w:color="auto"/>
+          <w:insideH w:val="single" w:sz="4" w:space="0" w:color="auto"/>
+          <w:insideV w:val="single" w:sz="4" w:space="0" w:color="auto"/>
+        </w:tblBorders>
+        <w:tblCellMar>
+          <w:left w:w="10" w:type="dxa"/>
+          <w:right w:w="10" w:type="dxa"/>
+        </w:tblCellMar>
+        <w:tblLook w:val="04A0" w:firstRow="1" w:lastRow="0" w:firstColumn="1" w:lastColumn="0" w:noHBand="0" w:noVBand="1"/>
+      </w:tblPr>
+      <w:tblGrid>
+        <w:gridCol w:w="6526"/>
+        <w:gridCol w:w="2500"/>
+      </w:tblGrid>
+      <w:tr>
+        <w:tblPrEx>
+          <w:tblCellMar>
+            <w:top w:w="0" w:type="dxa"/>
+            <w:bottom w:w="0" w:type="dxa"/>
+          </w:tblCellMar>
+        </w:tblPrEx>
+        <w:trPr>
+          <w:tblHeader/>
+        </w:trPr>
+        <w:tc>
+          <w:tcPr>
+            <w:tcW w:w="6526" w:type="dxa"/>
+            <w:tcBorders>
+              <w:top w:val="single" w:sz="4" w:space="0" w:color="C9C8C0"/>
+              <w:left w:val="single" w:sz="4" w:space="0" w:color="C9C8C0"/>
+              <w:bottom w:val="single" w:sz="4" w:space="0" w:color="C9C8C0"/>
+              <w:right w:val="single" w:sz="4" w:space="0" w:color="C9C8C0"/>
+            </w:tcBorders>
+            <w:shd w:val="clear" w:color="auto" w:fill="0F6B5C"/>
+            <w:tcMar>
+              <w:top w:w="70" w:type="dxa"/>
+              <w:left w:w="110" w:type="dxa"/>
+              <w:bottom w:w="70" w:type="dxa"/>
+              <w:right w:w="110" w:type="dxa"/>
+            </w:tcMar>
+          </w:tcPr>
+          <w:p>
+            <w:r>
+              <w:rPr>
+                <w:b/>
+                <w:bCs/>
+                <w:color w:val="FFFFFF"/>
+                <w:sz w:val="19"/>
+                <w:szCs w:val="19"/>
+              </w:rPr>
+              <w:t>Check</w:t>
+            </w:r>
+          </w:p>
+        </w:tc>
+        <w:tc>
+          <w:tcPr>
+            <w:tcW w:w="2500" w:type="dxa"/>
+            <w:tcBorders>
+              <w:top w:val="single" w:sz="4" w:space="0" w:color="C9C8C0"/>
+              <w:left w:val="single" w:sz="4" w:space="0" w:color="C9C8C0"/>
+              <w:bottom w:val="single" w:sz="4" w:space="0" w:color="C9C8C0"/>
+              <w:right w:val="single" w:sz="4" w:space="0" w:color="C9C8C0"/>
+            </w:tcBorders>
+            <w:shd w:val="clear" w:color="auto" w:fill="0F6B5C"/>
+            <w:tcMar>
+              <w:top w:w="70" w:type="dxa"/>
+              <w:left w:w="110" w:type="dxa"/>
+              <w:bottom w:w="70" w:type="dxa"/>
+              <w:right w:w="110" w:type="dxa"/>
+            </w:tcMar>
+          </w:tcPr>
+          <w:p>
+            <w:r>
+              <w:rPr>
+                <w:b/>
+                <w:bCs/>
+                <w:color w:val="FFFFFF"/>
+                <w:sz w:val="19"/>
+                <w:szCs w:val="19"/>
+              </w:rPr>
+              <w:t>Pass rate</w:t>
+            </w:r>
+          </w:p>
+        </w:tc>
+      </w:tr>
+      <w:tr>
+        <w:tblPrEx>
+          <w:tblCellMar>
+            <w:top w:w="0" w:type="dxa"/>
+            <w:bottom w:w="0" w:type="dxa"/>
+          </w:tblCellMar>
+        </w:tblPrEx>
+        <w:tc>
+          <w:tcPr>
+            <w:tcW w:w="6526" w:type="dxa"/>
+            <w:tcBorders>
+              <w:top w:val="single" w:sz="4" w:space="0" w:color="C9C8C0"/>
+              <w:left w:val="single" w:sz="4" w:space="0" w:color="C9C8C0"/>
+              <w:bottom w:val="single" w:sz="4" w:space="0" w:color="C9C8C0"/>
+              <w:right w:val="single" w:sz="4" w:space="0" w:color="C9C8C0"/>
+            </w:tcBorders>
+            <w:tcMar>
+              <w:top w:w="70" w:type="dxa"/>
+              <w:left w:w="110" w:type="dxa"/>
+              <w:bottom w:w="70" w:type="dxa"/>
+              <w:right w:w="110" w:type="dxa"/>
+            </w:tcMar>
+          </w:tcPr>
+          <w:p>
+            <w:r>
+              <w:rPr>
+                <w:sz w:val="19"/>
+                <w:szCs w:val="19"/>
+              </w:rPr>
+              <w:lastRenderedPageBreak/>
+              <w:t>Every number is grounded in the evidence</w:t>
+            </w:r>
+          </w:p>
+        </w:tc>
+        <w:tc>
+          <w:tcPr>
+            <w:tcW w:w="2500" w:type="dxa"/>
+            <w:tcBorders>
+              <w:top w:val="single" w:sz="4" w:space="0" w:color="C9C8C0"/>
+              <w:left w:val="single" w:sz="4" w:space="0" w:color="C9C8C0"/>
+              <w:bottom w:val="single" w:sz="4" w:space="0" w:color="C9C8C0"/>
+              <w:right w:val="single" w:sz="4" w:space="0" w:color="C9C8C0"/>
+            </w:tcBorders>
+            <w:tcMar>
+              <w:top w:w="70" w:type="dxa"/>
+              <w:left w:w="110" w:type="dxa"/>
+              <w:bottom w:w="70" w:type="dxa"/>
+              <w:right w:w="110" w:type="dxa"/>
+            </w:tcMar>
+          </w:tcPr>
+          <w:p>
+            <w:r>
+              <w:rPr>
+                <w:sz w:val="19"/>
+                <w:szCs w:val="19"/>
+              </w:rPr>
+              <w:t>100%</w:t>
+            </w:r>
+          </w:p>
+        </w:tc>
+      </w:tr>
+      <w:tr>
+        <w:tblPrEx>
+          <w:tblCellMar>
+            <w:top w:w="0" w:type="dxa"/>
+            <w:bottom w:w="0" w:type="dxa"/>
+          </w:tblCellMar>
+        </w:tblPrEx>
+        <w:tc>
+          <w:tcPr>
+            <w:tcW w:w="6526" w:type="dxa"/>
+            <w:tcBorders>
+              <w:top w:val="single" w:sz="4" w:space="0" w:color="C9C8C0"/>
+              <w:left w:val="single" w:sz="4" w:space="0" w:color="C9C8C0"/>
+              <w:bottom w:val="single" w:sz="4" w:space="0" w:color="C9C8C0"/>
+              <w:right w:val="single" w:sz="4" w:space="0" w:color="C9C8C0"/>
+            </w:tcBorders>
+            <w:tcMar>
+              <w:top w:w="70" w:type="dxa"/>
+              <w:left w:w="110" w:type="dxa"/>
+              <w:bottom w:w="70" w:type="dxa"/>
+              <w:right w:w="110" w:type="dxa"/>
+            </w:tcMar>
+          </w:tcPr>
+          <w:p>
+            <w:r>
+              <w:rPr>
+                <w:sz w:val="19"/>
+                <w:szCs w:val="19"/>
+              </w:rPr>
+              <w:t>Every citation is a real reason code or a retrieved SOP</w:t>
+            </w:r>
+          </w:p>
+        </w:tc>
+        <w:tc>
+          <w:tcPr>
+            <w:tcW w:w="2500" w:type="dxa"/>
+            <w:tcBorders>
+              <w:top w:val="single" w:sz="4" w:space="0" w:color="C9C8C0"/>
+              <w:left w:val="single" w:sz="4" w:space="0" w:color="C9C8C0"/>
+              <w:bottom w:val="single" w:sz="4" w:space="0" w:color="C9C8C0"/>
+              <w:right w:val="single" w:sz="4" w:space="0" w:color="C9C8C0"/>
+            </w:tcBorders>
+            <w:tcMar>
+              <w:top w:w="70" w:type="dxa"/>
+              <w:left w:w="110" w:type="dxa"/>
+              <w:bottom w:w="70" w:type="dxa"/>
+              <w:right w:w="110" w:type="dxa"/>
+            </w:tcMar>
+          </w:tcPr>
+          <w:p>
+            <w:r>
+              <w:rPr>
+                <w:sz w:val="19"/>
+                <w:szCs w:val="19"/>
+              </w:rPr>
+              <w:t>100%</w:t>
+            </w:r>
+          </w:p>
+        </w:tc>
+      </w:tr>
+      <w:tr>
+        <w:tblPrEx>
+          <w:tblCellMar>
+            <w:top w:w="0" w:type="dxa"/>
+            <w:bottom w:w="0" w:type="dxa"/>
+          </w:tblCellMar>
+        </w:tblPrEx>
+        <w:tc>
+          <w:tcPr>
+            <w:tcW w:w="6526" w:type="dxa"/>
+            <w:tcBorders>
+              <w:top w:val="single" w:sz="4" w:space="0" w:color="C9C8C0"/>
+              <w:left w:val="single" w:sz="4" w:space="0" w:color="C9C8C0"/>
+              <w:bottom w:val="single" w:sz="4" w:space="0" w:color="C9C8C0"/>
+              <w:right w:val="single" w:sz="4" w:space="0" w:color="C9C8C0"/>
+            </w:tcBorders>
+            <w:tcMar>
+              <w:top w:w="70" w:type="dxa"/>
+              <w:left w:w="110" w:type="dxa"/>
+              <w:bottom w:w="70" w:type="dxa"/>
+              <w:right w:w="110" w:type="dxa"/>
+            </w:tcMar>
+          </w:tcPr>
+          <w:p>
+            <w:r>
+              <w:rPr>
+                <w:sz w:val="19"/>
+                <w:szCs w:val="19"/>
+              </w:rPr>
+              <w:t>States the alert's real decision, never another</w:t>
+            </w:r>
+          </w:p>
+        </w:tc>
+        <w:tc>
+          <w:tcPr>
+            <w:tcW w:w="2500" w:type="dxa"/>
+            <w:tcBorders>
+              <w:top w:val="single" w:sz="4" w:space="0" w:color="C9C8C0"/>
+              <w:left w:val="single" w:sz="4" w:space="0" w:color="C9C8C0"/>
+              <w:bottom w:val="single" w:sz="4" w:space="0" w:color="C9C8C0"/>
+              <w:right w:val="single" w:sz="4" w:space="0" w:color="C9C8C0"/>
+            </w:tcBorders>
+            <w:tcMar>
+              <w:top w:w="70" w:type="dxa"/>
+              <w:left w:w="110" w:type="dxa"/>
+              <w:bottom w:w="70" w:type="dxa"/>
+              <w:right w:w="110" w:type="dxa"/>
+            </w:tcMar>
+          </w:tcPr>
+          <w:p>
+            <w:r>
+              <w:rPr>
+                <w:sz w:val="19"/>
+                <w:szCs w:val="19"/>
+              </w:rPr>
+              <w:t>100%</w:t>
+            </w:r>
+          </w:p>
+        </w:tc>
+      </w:tr>
+      <w:tr>
+        <w:tblPrEx>
+          <w:tblCellMar>
+            <w:top w:w="0" w:type="dxa"/>
+            <w:bottom w:w="0" w:type="dxa"/>
+          </w:tblCellMar>
+        </w:tblPrEx>
+        <w:tc>
+          <w:tcPr>
+            <w:tcW w:w="6526" w:type="dxa"/>
+            <w:tcBorders>
+              <w:top w:val="single" w:sz="4" w:space="0" w:color="C9C8C0"/>
+              <w:left w:val="single" w:sz="4" w:space="0" w:color="C9C8C0"/>
+              <w:bottom w:val="single" w:sz="4" w:space="0" w:color="C9C8C0"/>
+              <w:right w:val="single" w:sz="4" w:space="0" w:color="C9C8C0"/>
+            </w:tcBorders>
+            <w:tcMar>
+              <w:top w:w="70" w:type="dxa"/>
+              <w:left w:w="110" w:type="dxa"/>
+              <w:bottom w:w="70" w:type="dxa"/>
+              <w:right w:w="110" w:type="dxa"/>
+            </w:tcMar>
+          </w:tcPr>
+          <w:p>
+            <w:r>
+              <w:rPr>
+                <w:sz w:val="19"/>
+                <w:szCs w:val="19"/>
+              </w:rPr>
+              <w:t>Recommends at least one SOP-referenced action</w:t>
+            </w:r>
+          </w:p>
+        </w:tc>
+        <w:tc>
+          <w:tcPr>
+            <w:tcW w:w="2500" w:type="dxa"/>
+            <w:tcBorders>
+              <w:top w:val="single" w:sz="4" w:space="0" w:color="C9C8C0"/>
+              <w:left w:val="single" w:sz="4" w:space="0" w:color="C9C8C0"/>
+              <w:bottom w:val="single" w:sz="4" w:space="0" w:color="C9C8C0"/>
+              <w:right w:val="single" w:sz="4" w:space="0" w:color="C9C8C0"/>
+            </w:tcBorders>
+            <w:tcMar>
+              <w:top w:w="70" w:type="dxa"/>
+              <w:left w:w="110" w:type="dxa"/>
+              <w:bottom w:w="70" w:type="dxa"/>
+              <w:right w:w="110" w:type="dxa"/>
+            </w:tcMar>
+          </w:tcPr>
+          <w:p>
+            <w:r>
+              <w:rPr>
+                <w:sz w:val="19"/>
+                <w:szCs w:val="19"/>
+              </w:rPr>
+              <w:t>100%</w:t>
+            </w:r>
+          </w:p>
+        </w:tc>
+      </w:tr>
+      <w:tr>
+        <w:tblPrEx>
+          <w:tblCellMar>
+            <w:top w:w="0" w:type="dxa"/>
+            <w:bottom w:w="0" w:type="dxa"/>
+          </w:tblCellMar>
+        </w:tblPrEx>
+        <w:tc>
+          <w:tcPr>
+            <w:tcW w:w="6526" w:type="dxa"/>
+            <w:tcBorders>
+              <w:top w:val="single" w:sz="4" w:space="0" w:color="C9C8C0"/>
+              <w:left w:val="single" w:sz="4" w:space="0" w:color="C9C8C0"/>
+              <w:bottom w:val="single" w:sz="4" w:space="0" w:color="C9C8C0"/>
+              <w:right w:val="single" w:sz="4" w:space="0" w:color="C9C8C0"/>
+            </w:tcBorders>
+            <w:tcMar>
+              <w:top w:w="70" w:type="dxa"/>
+              <w:left w:w="110" w:type="dxa"/>
+              <w:bottom w:w="70" w:type="dxa"/>
+              <w:right w:w="110" w:type="dxa"/>
+            </w:tcMar>
+          </w:tcPr>
+          <w:p>
+            <w:r>
+              <w:rPr>
+                <w:sz w:val="19"/>
+                <w:szCs w:val="19"/>
+              </w:rPr>
+              <w:t>A fabricated summary with invented numbers is rejected</w:t>
+            </w:r>
+          </w:p>
+        </w:tc>
+        <w:tc>
+          <w:tcPr>
+            <w:tcW w:w="2500" w:type="dxa"/>
+            <w:tcBorders>
+              <w:top w:val="single" w:sz="4" w:space="0" w:color="C9C8C0"/>
+              <w:left w:val="single" w:sz="4" w:space="0" w:color="C9C8C0"/>
+              <w:bottom w:val="single" w:sz="4" w:space="0" w:color="C9C8C0"/>
+              <w:right w:val="single" w:sz="4" w:space="0" w:color="C9C8C0"/>
+            </w:tcBorders>
+            <w:tcMar>
+              <w:top w:w="70" w:type="dxa"/>
+              <w:left w:w="110" w:type="dxa"/>
+              <w:bottom w:w="70" w:type="dxa"/>
+              <w:right w:w="110" w:type="dxa"/>
+            </w:tcMar>
+          </w:tcPr>
+          <w:p>
+            <w:r>
+              <w:rPr>
+                <w:sz w:val="19"/>
+                <w:szCs w:val="19"/>
+              </w:rPr>
+              <w:t>Yes</w:t>
+            </w:r>
+          </w:p>
+        </w:tc>
+      </w:tr>
+    </w:tbl>
+    <w:p>
+      <w:pPr>
+        <w:spacing w:after="60"/>
+      </w:pPr>
+    </w:p>
+    <w:p>
+      <w:pPr>
+        <w:spacing w:after="120" w:line="288" w:lineRule="auto"/>
+      </w:pPr>
+      <w:r>
+        <w:t>The harness also found a real defect: the grounding guard read "SOP-05"</w:t>
+      </w:r>
+      <w:r>
+        <w:t xml:space="preserve"> as the number 5, which would have rejected valid AI summaries and silently replaced them with templates. It was fixed and covered by a regression test.</w:t>
+      </w:r>
+    </w:p>
+    <w:p>
+      <w:pPr>
         <w:pStyle w:val="Heading1"/>
       </w:pPr>
-      <w:bookmarkStart w:id="15" w:name="_Toc241992997"/>
+      <w:bookmarkStart w:id="17" w:name="_Toc242035580"/>
       <w:r>
         <w:t>6. Intended Real-Life Impact</w:t>
       </w:r>
-      <w:bookmarkEnd w:id="15"/>
+      <w:bookmarkEnd w:id="17"/>
     </w:p>
     <w:tbl>
       <w:tblPr>
@@ -6290,14 +7627,14 @@
       <w:pPr>
         <w:pStyle w:val="Heading2"/>
       </w:pPr>
-      <w:bookmarkStart w:id="16" w:name="_Toc241992998"/>
+      <w:bookmarkStart w:id="18" w:name="_Toc242035581"/>
       <w:r>
         <w:t xml:space="preserve">6.1 Integration </w:t>
       </w:r>
       <w:r>
         <w:t>and scaling path</w:t>
       </w:r>
-      <w:bookmarkEnd w:id="16"/>
+      <w:bookmarkEnd w:id="18"/>
     </w:p>
     <w:p>
       <w:pPr>
@@ -6334,11 +7671,11 @@
       <w:pPr>
         <w:pStyle w:val="Heading1"/>
       </w:pPr>
-      <w:bookmarkStart w:id="17" w:name="_Toc241992999"/>
+      <w:bookmarkStart w:id="19" w:name="_Toc242035582"/>
       <w:r>
         <w:t>7. Responsible AI and Security</w:t>
       </w:r>
-      <w:bookmarkEnd w:id="17"/>
+      <w:bookmarkEnd w:id="19"/>
     </w:p>
     <w:p>
       <w:pPr>
@@ -6354,7 +7691,14 @@
           <w:b/>
           <w:bCs/>
         </w:rPr>
-        <w:t>Synthetic data only</w:t>
+        <w:t>Synthetic d</w:t>
+      </w:r>
+      <w:r>
+        <w:rPr>
+          <w:b/>
+          <w:bCs/>
+        </w:rPr>
+        <w:t>ata only</w:t>
       </w:r>
       <w:r>
         <w:t>; only pseudonymous IDs are ever sent to the LLM.</w:t>
@@ -6417,10 +7761,7 @@
         <w:t>Fairness audit</w:t>
       </w:r>
       <w:r>
-        <w:t xml:space="preserve"> of false-p</w:t>
-      </w:r>
-      <w:r>
-        <w:t>ositive rates across division, age, KYC level and tenure. Shopkeepers and new accounts currently show a higher rate, handled through segment overrides and merchant onboarding.</w:t>
+        <w:t xml:space="preserve"> of false-positive rates across division, age, KYC level and tenure. Shopkeepers and new accounts currently show a higher rate, handled through segment overrides and merchant onboarding.</w:t>
       </w:r>
     </w:p>
     <w:p>
@@ -6438,24 +7779,14 @@
           <w:bCs/>
         </w:rPr>
         <w:lastRenderedPageBreak/>
-        <w:t>Security</w:t>
-      </w:r>
-      <w:r>
-        <w:t>: JWT roles, rate limiting, sandboxed policy expressions, prompt-injecti</w:t>
-      </w:r>
-      <w:r>
-        <w:t>on isolation, an audit log, and an admin page that can be restricted by IP address.</w:t>
-      </w:r>
-    </w:p>
-    <w:p>
-      <w:pPr>
-        <w:pStyle w:val="Heading1"/>
-      </w:pPr>
-      <w:bookmarkStart w:id="18" w:name="_Toc241993000"/>
-      <w:r>
-        <w:t>8. Limitations and Future Work</w:t>
-      </w:r>
-      <w:bookmarkEnd w:id="18"/>
+        <w:t>Admin protection</w:t>
+      </w:r>
+      <w:r>
+        <w:t xml:space="preserve">: the website signs visitors in automatically as the </w:t>
+      </w:r>
+      <w:r>
+        <w:t>demo customer and analyst only. Changing the live policy or model requires a separate admin password that is never built into the website; in production, admin login is disabled until that password is set.</w:t>
+      </w:r>
     </w:p>
     <w:p>
       <w:pPr>
@@ -6467,8 +7798,31 @@
         <w:spacing w:after="60" w:line="276" w:lineRule="auto"/>
       </w:pPr>
       <w:r>
-        <w:t>Synthetic fraud patterns are easier than real fraud; real performance must be established with governed upay data, starting in shadow mode.</w:t>
-      </w:r>
+        <w:rPr>
+          <w:b/>
+          <w:bCs/>
+        </w:rPr>
+        <w:t>Security</w:t>
+      </w:r>
+      <w:r>
+        <w:t>: JWT roles, rate limiting, sandboxed poli</w:t>
+      </w:r>
+      <w:r>
+        <w:t>cy expressions, prompt-injection isolation, an audit log, automated dependency-vulnerability audit in CI (0 known vulnerabilities after upgrading FastAPI/Starlette, PyJWT and python-multipart), secret scanning, and an accessibility audit with 0 WCAG 2.1 AA</w:t>
+      </w:r>
+      <w:r>
+        <w:t xml:space="preserve"> violations on all pages.</w:t>
+      </w:r>
+    </w:p>
+    <w:p>
+      <w:pPr>
+        <w:pStyle w:val="Heading1"/>
+      </w:pPr>
+      <w:bookmarkStart w:id="20" w:name="_Toc242035583"/>
+      <w:r>
+        <w:t>8. Limitations and Future Work</w:t>
+      </w:r>
+      <w:bookmarkEnd w:id="20"/>
     </w:p>
     <w:p>
       <w:pPr>
@@ -6480,10 +7834,7 @@
         <w:spacing w:after="60" w:line="276" w:lineRule="auto"/>
       </w:pPr>
       <w:r>
-        <w:t>L</w:t>
-      </w:r>
-      <w:r>
-        <w:t>ive feature state is held in a single API worker; production needs a shared feature store.</w:t>
+        <w:t>Synthetic fraud patterns are easier than real fraud; real performance must be established with governed upay data, starting in shadow mode.</w:t>
       </w:r>
     </w:p>
     <w:p>
@@ -6496,36 +7847,11 @@
         <w:spacing w:after="60" w:line="276" w:lineRule="auto"/>
       </w:pPr>
       <w:r>
-        <w:t>The calibration window is small, and SOP retrieval uses BM25 rather than semantic search.</w:t>
-      </w:r>
-    </w:p>
-    <w:p>
-      <w:pPr>
-        <w:spacing w:after="120" w:line="288" w:lineRule="auto"/>
-      </w:pPr>
-      <w:r>
-        <w:rPr>
-          <w:b/>
-          <w:bCs/>
-        </w:rPr>
-        <w:t>Next steps:</w:t>
-      </w:r>
-      <w:r>
-        <w:t xml:space="preserve"> a shared feature store, shadow evaluation on real data, A/B tes</w:t>
-      </w:r>
-      <w:r>
-        <w:t>ting of warning designs, Bangla voice warnings, and agent-risk benchmarking.</w:t>
-      </w:r>
-    </w:p>
-    <w:p>
-      <w:pPr>
-        <w:pStyle w:val="Heading1"/>
-      </w:pPr>
-      <w:bookmarkStart w:id="19" w:name="_Toc241993001"/>
-      <w:r>
-        <w:t>9. Disclosures</w:t>
-      </w:r>
-      <w:bookmarkEnd w:id="19"/>
+        <w:t>Live feature state is held in a single API worker; producti</w:t>
+      </w:r>
+      <w:r>
+        <w:t>on needs a shared feature store.</w:t>
+      </w:r>
     </w:p>
     <w:p>
       <w:pPr>
@@ -6537,15 +7863,36 @@
         <w:spacing w:after="60" w:line="276" w:lineRule="auto"/>
       </w:pPr>
       <w:r>
+        <w:t>The calibration window is small, and SOP retrieval uses BM25 rather than semantic search.</w:t>
+      </w:r>
+    </w:p>
+    <w:p>
+      <w:pPr>
+        <w:spacing w:after="120" w:line="288" w:lineRule="auto"/>
+      </w:pPr>
+      <w:r>
         <w:rPr>
           <w:b/>
           <w:bCs/>
         </w:rPr>
-        <w:t>External services:</w:t>
-      </w:r>
-      <w:r>
-        <w:t xml:space="preserve"> Google Gemini API and Anthropic Claude API, both optional. They are used only for natural-language summaries and chat, never for risk decisions.</w:t>
-      </w:r>
+        <w:t>Next steps:</w:t>
+      </w:r>
+      <w:r>
+        <w:t xml:space="preserve"> a shared feature store, shadow evaluation on real data, A/B testing of warning designs, Bangla voice warnings, and agent-</w:t>
+      </w:r>
+      <w:r>
+        <w:t>risk benchmarking.</w:t>
+      </w:r>
+    </w:p>
+    <w:p>
+      <w:pPr>
+        <w:pStyle w:val="Heading1"/>
+      </w:pPr>
+      <w:bookmarkStart w:id="21" w:name="_Toc242035584"/>
+      <w:r>
+        <w:t>9. Disclosures</w:t>
+      </w:r>
+      <w:bookmarkEnd w:id="21"/>
     </w:p>
     <w:p>
       <w:pPr>
@@ -6561,10 +7908,10 @@
           <w:b/>
           <w:bCs/>
         </w:rPr>
-        <w:t>Pre-trained models and datasets:</w:t>
-      </w:r>
-      <w:r>
-        <w:t xml:space="preserve"> none. All ML models are trained from scratch on our own seeded synthetic data.</w:t>
+        <w:t>External services:</w:t>
+      </w:r>
+      <w:r>
+        <w:t xml:space="preserve"> Google Gemini API and Anthropic Claude API, both optional. They are used only for natural-language summaries and chat, never for risk decisions.</w:t>
       </w:r>
     </w:p>
     <w:p>
@@ -6581,10 +7928,13 @@
           <w:b/>
           <w:bCs/>
         </w:rPr>
-        <w:t>SOP documents</w:t>
-      </w:r>
-      <w:r>
-        <w:t xml:space="preserve"> were written by the team for the demo and are not official upay documents.</w:t>
+        <w:t>Pre-trained models and datasets:</w:t>
+      </w:r>
+      <w:r>
+        <w:t xml:space="preserve"> none. All ML models are t</w:t>
+      </w:r>
+      <w:r>
+        <w:t>rained from scratch on our own seeded synthetic data.</w:t>
       </w:r>
     </w:p>
     <w:p>
@@ -6601,18 +7951,517 @@
           <w:b/>
           <w:bCs/>
         </w:rPr>
+        <w:t>SOP documents</w:t>
+      </w:r>
+      <w:r>
+        <w:t xml:space="preserve"> were written by the team for the demo and are not official upay documents.</w:t>
+      </w:r>
+    </w:p>
+    <w:p>
+      <w:pPr>
+        <w:pStyle w:val="ListParagraph"/>
+        <w:numPr>
+          <w:ilvl w:val="0"/>
+          <w:numId w:val="2"/>
+        </w:numPr>
+        <w:spacing w:after="60" w:line="276" w:lineRule="auto"/>
+      </w:pPr>
+      <w:r>
+        <w:rPr>
+          <w:b/>
+          <w:bCs/>
+        </w:rPr>
         <w:t>Open-source libraries:</w:t>
       </w:r>
       <w:r>
-        <w:t xml:space="preserve"> FastAPI, LightGBM, scikit-learn,</w:t>
-      </w:r>
-      <w:r>
-        <w:t xml:space="preserve"> NetworkX, Next.js, React, Tailwind CSS, Recharts and others, used under their licences (full list in DISCLOSURES.md).</w:t>
+        <w:t xml:space="preserve"> FastAPI, LightGBM, scikit-learn, NetworkX, Next.js, React, Tailwind CSS, Recharts and othe</w:t>
+      </w:r>
+      <w:r>
+        <w:t>rs, used under their licences (full list in DISCLOSURES.md).</w:t>
+      </w:r>
+    </w:p>
+    <w:p>
+      <w:r>
+        <w:br w:type="page"/>
+      </w:r>
+    </w:p>
+    <w:p>
+      <w:pPr>
+        <w:pStyle w:val="Heading1"/>
+      </w:pPr>
+      <w:bookmarkStart w:id="22" w:name="_Toc242035585"/>
+      <w:r>
+        <w:lastRenderedPageBreak/>
+        <w:t>Appendix: Screenshots</w:t>
+      </w:r>
+      <w:bookmarkEnd w:id="22"/>
+    </w:p>
+    <w:p>
+      <w:pPr>
+        <w:spacing w:before="120"/>
+        <w:jc w:val="center"/>
+      </w:pPr>
+      <w:r>
+        <w:rPr>
+          <w:noProof/>
+        </w:rPr>
+        <w:drawing>
+          <wp:inline distT="0" distB="0" distL="0" distR="0">
+            <wp:extent cx="5715000" cy="3571875"/>
+            <wp:effectExtent l="0" t="0" r="0" b="0"/>
+            <wp:docPr id="1" name="01-home.png" descr="Figure 1: Overview page with the value proposition, live results and the decision pipeline." title="Figure 1: Overview page with the value proposition, live results and the decision pipeline."/>
+            <wp:cNvGraphicFramePr>
+              <a:graphicFrameLocks xmlns:a="http://schemas.openxmlformats.org/drawingml/2006/main" noChangeAspect="1"/>
+            </wp:cNvGraphicFramePr>
+            <a:graphic xmlns:a="http://schemas.openxmlformats.org/drawingml/2006/main">
+              <a:graphicData uri="http://schemas.openxmlformats.org/drawingml/2006/picture">
+                <pic:pic xmlns:pic="http://schemas.openxmlformats.org/drawingml/2006/picture">
+                  <pic:nvPicPr>
+                    <pic:cNvPr id="0" name=""/>
+                    <pic:cNvPicPr>
+                      <a:picLocks noChangeAspect="1" noChangeArrowheads="1"/>
+                    </pic:cNvPicPr>
+                  </pic:nvPicPr>
+                  <pic:blipFill>
+                    <a:blip r:embed="rId8"/>
+                    <a:srcRect/>
+                    <a:stretch>
+                      <a:fillRect/>
+                    </a:stretch>
+                  </pic:blipFill>
+                  <pic:spPr bwMode="auto">
+                    <a:xfrm>
+                      <a:off x="0" y="0"/>
+                      <a:ext cx="5715000" cy="3571875"/>
+                    </a:xfrm>
+                    <a:prstGeom prst="rect">
+                      <a:avLst/>
+                    </a:prstGeom>
+                  </pic:spPr>
+                </pic:pic>
+              </a:graphicData>
+            </a:graphic>
+          </wp:inline>
+        </w:drawing>
+      </w:r>
+    </w:p>
+    <w:p>
+      <w:pPr>
+        <w:spacing w:before="60" w:after="200"/>
+      </w:pPr>
+      <w:r>
+        <w:rPr>
+          <w:i/>
+          <w:iCs/>
+          <w:color w:val="52514E"/>
+          <w:sz w:val="18"/>
+          <w:szCs w:val="18"/>
+        </w:rPr>
+        <w:t>Figure 1: Overview page with the value proposition, live results and the decision pipeline.</w:t>
+      </w:r>
+    </w:p>
+    <w:p>
+      <w:pPr>
+        <w:spacing w:before="120"/>
+        <w:jc w:val="center"/>
+      </w:pPr>
+      <w:r>
+        <w:rPr>
+          <w:noProof/>
+        </w:rPr>
+        <w:drawing>
+          <wp:inline distT="0" distB="0" distL="0" distR="0">
+            <wp:extent cx="5715000" cy="3571875"/>
+            <wp:effectExtent l="0" t="0" r="0" b="0"/>
+            <wp:docPr id="2" name="03-customer-hold.png" descr="Figure 2: Account takeover held in the customer wallet, with a plain Bangla explanation." title="Figure 2: Account takeover held in the customer wallet, with a plain Bangla explanation."/>
+            <wp:cNvGraphicFramePr>
+              <a:graphicFrameLocks xmlns:a="http://schemas.openxmlformats.org/drawingml/2006/main" noChangeAspect="1"/>
+            </wp:cNvGraphicFramePr>
+            <a:graphic xmlns:a="http://schemas.openxmlformats.org/drawingml/2006/main">
+              <a:graphicData uri="http://schemas.openxmlformats.org/drawingml/2006/picture">
+                <pic:pic xmlns:pic="http://schemas.openxmlformats.org/drawingml/2006/picture">
+                  <pic:nvPicPr>
+                    <pic:cNvPr id="0" name=""/>
+                    <pic:cNvPicPr>
+                      <a:picLocks noChangeAspect="1" noChangeArrowheads="1"/>
+                    </pic:cNvPicPr>
+                  </pic:nvPicPr>
+                  <pic:blipFill>
+                    <a:blip r:embed="rId9"/>
+                    <a:srcRect/>
+                    <a:stretch>
+                      <a:fillRect/>
+                    </a:stretch>
+                  </pic:blipFill>
+                  <pic:spPr bwMode="auto">
+                    <a:xfrm>
+                      <a:off x="0" y="0"/>
+                      <a:ext cx="5715000" cy="3571875"/>
+                    </a:xfrm>
+                    <a:prstGeom prst="rect">
+                      <a:avLst/>
+                    </a:prstGeom>
+                  </pic:spPr>
+                </pic:pic>
+              </a:graphicData>
+            </a:graphic>
+          </wp:inline>
+        </w:drawing>
+      </w:r>
+    </w:p>
+    <w:p>
+      <w:pPr>
+        <w:spacing w:before="60" w:after="200"/>
+      </w:pPr>
+      <w:r>
+        <w:rPr>
+          <w:i/>
+          <w:iCs/>
+          <w:color w:val="52514E"/>
+          <w:sz w:val="18"/>
+          <w:szCs w:val="18"/>
+        </w:rPr>
+        <w:t>Figure 2: Account takeover held in the customer wallet, with a plain Bangla explanation.</w:t>
+      </w:r>
+    </w:p>
+    <w:p>
+      <w:pPr>
+        <w:spacing w:before="120"/>
+        <w:jc w:val="center"/>
+      </w:pPr>
+      <w:r>
+        <w:rPr>
+          <w:noProof/>
+        </w:rPr>
+        <w:lastRenderedPageBreak/>
+        <w:drawing>
+          <wp:inline distT="0" distB="0" distL="0" distR="0">
+            <wp:extent cx="5715000" cy="5457825"/>
+            <wp:effectExtent l="0" t="0" r="0" b="0"/>
+            <wp:docPr id="3" name="04-customer-ai-tab.png" descr="Figure 3: What the AI saw: the exact request, the flagged new phone and area, the risk level against the thresholds, and why the transfer was held." title="Figure 3: What the AI saw: the exact request, the flagged new phone and area, the risk level against the thresholds, and why the transfer was held."/>
+            <wp:cNvGraphicFramePr>
+              <a:graphicFrameLocks xmlns:a="http://schemas.openxmlformats.org/drawingml/2006/main" noChangeAspect="1"/>
+            </wp:cNvGraphicFramePr>
+            <a:graphic xmlns:a="http://schemas.openxmlformats.org/drawingml/2006/main">
+              <a:graphicData uri="http://schemas.openxmlformats.org/drawingml/2006/picture">
+                <pic:pic xmlns:pic="http://schemas.openxmlformats.org/drawingml/2006/picture">
+                  <pic:nvPicPr>
+                    <pic:cNvPr id="0" name=""/>
+                    <pic:cNvPicPr>
+                      <a:picLocks noChangeAspect="1" noChangeArrowheads="1"/>
+                    </pic:cNvPicPr>
+                  </pic:nvPicPr>
+                  <pic:blipFill>
+                    <a:blip r:embed="rId10"/>
+                    <a:srcRect/>
+                    <a:stretch>
+                      <a:fillRect/>
+                    </a:stretch>
+                  </pic:blipFill>
+                  <pic:spPr bwMode="auto">
+                    <a:xfrm>
+                      <a:off x="0" y="0"/>
+                      <a:ext cx="5715000" cy="5457825"/>
+                    </a:xfrm>
+                    <a:prstGeom prst="rect">
+                      <a:avLst/>
+                    </a:prstGeom>
+                  </pic:spPr>
+                </pic:pic>
+              </a:graphicData>
+            </a:graphic>
+          </wp:inline>
+        </w:drawing>
+      </w:r>
+    </w:p>
+    <w:p>
+      <w:pPr>
+        <w:spacing w:before="60" w:after="200"/>
+      </w:pPr>
+      <w:r>
+        <w:rPr>
+          <w:i/>
+          <w:iCs/>
+          <w:color w:val="52514E"/>
+          <w:sz w:val="18"/>
+          <w:szCs w:val="18"/>
+        </w:rPr>
+        <w:t>Figure 3: What the AI saw: the exact request, the flagged new phone and area, the risk level against the thresholds, and why the transfer was held.</w:t>
+      </w:r>
+    </w:p>
+    <w:p>
+      <w:pPr>
+        <w:spacing w:before="120"/>
+        <w:jc w:val="center"/>
+      </w:pPr>
+      <w:r>
+        <w:rPr>
+          <w:noProof/>
+        </w:rPr>
+        <w:lastRenderedPageBreak/>
+        <w:drawing>
+          <wp:inline distT="0" distB="0" distL="0" distR="0">
+            <wp:extent cx="5715000" cy="3571875"/>
+            <wp:effectExtent l="0" t="0" r="0" b="0"/>
+            <wp:docPr id="4" name="05-analyst-queue.png" descr="Figure 4: Analyst console with the ranked alert queue and a start-here guide." title="Figure 4: Analyst console with the ranked alert queue and a start-here guide."/>
+            <wp:cNvGraphicFramePr>
+              <a:graphicFrameLocks xmlns:a="http://schemas.openxmlformats.org/drawingml/2006/main" noChangeAspect="1"/>
+            </wp:cNvGraphicFramePr>
+            <a:graphic xmlns:a="http://schemas.openxmlformats.org/drawingml/2006/main">
+              <a:graphicData uri="http://schemas.openxmlformats.org/drawingml/2006/picture">
+                <pic:pic xmlns:pic="http://schemas.openxmlformats.org/drawingml/2006/picture">
+                  <pic:nvPicPr>
+                    <pic:cNvPr id="0" name=""/>
+                    <pic:cNvPicPr>
+                      <a:picLocks noChangeAspect="1" noChangeArrowheads="1"/>
+                    </pic:cNvPicPr>
+                  </pic:nvPicPr>
+                  <pic:blipFill>
+                    <a:blip r:embed="rId11"/>
+                    <a:srcRect/>
+                    <a:stretch>
+                      <a:fillRect/>
+                    </a:stretch>
+                  </pic:blipFill>
+                  <pic:spPr bwMode="auto">
+                    <a:xfrm>
+                      <a:off x="0" y="0"/>
+                      <a:ext cx="5715000" cy="3571875"/>
+                    </a:xfrm>
+                    <a:prstGeom prst="rect">
+                      <a:avLst/>
+                    </a:prstGeom>
+                  </pic:spPr>
+                </pic:pic>
+              </a:graphicData>
+            </a:graphic>
+          </wp:inline>
+        </w:drawing>
+      </w:r>
+    </w:p>
+    <w:p>
+      <w:pPr>
+        <w:spacing w:before="60" w:after="200"/>
+      </w:pPr>
+      <w:r>
+        <w:rPr>
+          <w:i/>
+          <w:iCs/>
+          <w:color w:val="52514E"/>
+          <w:sz w:val="18"/>
+          <w:szCs w:val="18"/>
+        </w:rPr>
+        <w:t>Figure 4: Analy</w:t>
+      </w:r>
+      <w:r>
+        <w:rPr>
+          <w:i/>
+          <w:iCs/>
+          <w:color w:val="52514E"/>
+          <w:sz w:val="18"/>
+          <w:szCs w:val="18"/>
+        </w:rPr>
+        <w:t>st console with the ranked alert queue and a start-here guide.</w:t>
+      </w:r>
+    </w:p>
+    <w:p>
+      <w:pPr>
+        <w:spacing w:before="120"/>
+        <w:jc w:val="center"/>
+      </w:pPr>
+      <w:r>
+        <w:rPr>
+          <w:noProof/>
+        </w:rPr>
+        <w:lastRenderedPageBreak/>
+        <w:drawing>
+          <wp:inline distT="0" distB="0" distL="0" distR="0">
+            <wp:extent cx="5229225" cy="7239000"/>
+            <wp:effectExtent l="0" t="0" r="0" b="0"/>
+            <wp:docPr id="5" name="06-case.png" descr="Figure 5: Case view with evidence, SHAP drivers, the mule-ring network and the AI case summary." title="Figure 5: Case view with evidence, SHAP drivers, the mule-ring network and the AI case summary."/>
+            <wp:cNvGraphicFramePr>
+              <a:graphicFrameLocks xmlns:a="http://schemas.openxmlformats.org/drawingml/2006/main" noChangeAspect="1"/>
+            </wp:cNvGraphicFramePr>
+            <a:graphic xmlns:a="http://schemas.openxmlformats.org/drawingml/2006/main">
+              <a:graphicData uri="http://schemas.openxmlformats.org/drawingml/2006/picture">
+                <pic:pic xmlns:pic="http://schemas.openxmlformats.org/drawingml/2006/picture">
+                  <pic:nvPicPr>
+                    <pic:cNvPr id="0" name=""/>
+                    <pic:cNvPicPr>
+                      <a:picLocks noChangeAspect="1" noChangeArrowheads="1"/>
+                    </pic:cNvPicPr>
+                  </pic:nvPicPr>
+                  <pic:blipFill>
+                    <a:blip r:embed="rId12"/>
+                    <a:srcRect/>
+                    <a:stretch>
+                      <a:fillRect/>
+                    </a:stretch>
+                  </pic:blipFill>
+                  <pic:spPr bwMode="auto">
+                    <a:xfrm>
+                      <a:off x="0" y="0"/>
+                      <a:ext cx="5229225" cy="7239000"/>
+                    </a:xfrm>
+                    <a:prstGeom prst="rect">
+                      <a:avLst/>
+                    </a:prstGeom>
+                  </pic:spPr>
+                </pic:pic>
+              </a:graphicData>
+            </a:graphic>
+          </wp:inline>
+        </w:drawing>
+      </w:r>
+    </w:p>
+    <w:p>
+      <w:pPr>
+        <w:spacing w:before="60" w:after="200"/>
+      </w:pPr>
+      <w:r>
+        <w:rPr>
+          <w:i/>
+          <w:iCs/>
+          <w:color w:val="52514E"/>
+          <w:sz w:val="18"/>
+          <w:szCs w:val="18"/>
+        </w:rPr>
+        <w:t>Figure 5: Case view with evidence, SHAP drivers, the mule-ring network and the AI case summary.</w:t>
+      </w:r>
+    </w:p>
+    <w:p>
+      <w:pPr>
+        <w:spacing w:before="120"/>
+        <w:jc w:val="center"/>
+      </w:pPr>
+      <w:r>
+        <w:rPr>
+          <w:noProof/>
+        </w:rPr>
+        <w:lastRenderedPageBreak/>
+        <w:drawing>
+          <wp:inline distT="0" distB="0" distL="0" distR="0">
+            <wp:extent cx="5591175" cy="7239000"/>
+            <wp:effectExtent l="0" t="0" r="0" b="0"/>
+            <wp:docPr id="6" name="07-impact.png" descr="Figure 6: Impact dashboard with lift over baselines, recall per fraud scenario and the fairness audit." title="Figure 6: Impact dashboard with lift over baselines, recall per fraud scenario and the fairness audit."/>
+            <wp:cNvGraphicFramePr>
+              <a:graphicFrameLocks xmlns:a="http://schemas.openxmlformats.org/drawingml/2006/main" noChangeAspect="1"/>
+            </wp:cNvGraphicFramePr>
+            <a:graphic xmlns:a="http://schemas.openxmlformats.org/drawingml/2006/main">
+              <a:graphicData uri="http://schemas.openxmlformats.org/drawingml/2006/picture">
+                <pic:pic xmlns:pic="http://schemas.openxmlformats.org/drawingml/2006/picture">
+                  <pic:nvPicPr>
+                    <pic:cNvPr id="0" name=""/>
+                    <pic:cNvPicPr>
+                      <a:picLocks noChangeAspect="1" noChangeArrowheads="1"/>
+                    </pic:cNvPicPr>
+                  </pic:nvPicPr>
+                  <pic:blipFill>
+                    <a:blip r:embed="rId13"/>
+                    <a:srcRect/>
+                    <a:stretch>
+                      <a:fillRect/>
+                    </a:stretch>
+                  </pic:blipFill>
+                  <pic:spPr bwMode="auto">
+                    <a:xfrm>
+                      <a:off x="0" y="0"/>
+                      <a:ext cx="5591175" cy="7239000"/>
+                    </a:xfrm>
+                    <a:prstGeom prst="rect">
+                      <a:avLst/>
+                    </a:prstGeom>
+                  </pic:spPr>
+                </pic:pic>
+              </a:graphicData>
+            </a:graphic>
+          </wp:inline>
+        </w:drawing>
+      </w:r>
+    </w:p>
+    <w:p>
+      <w:pPr>
+        <w:spacing w:before="60" w:after="200"/>
+      </w:pPr>
+      <w:r>
+        <w:rPr>
+          <w:i/>
+          <w:iCs/>
+          <w:color w:val="52514E"/>
+          <w:sz w:val="18"/>
+          <w:szCs w:val="18"/>
+        </w:rPr>
+        <w:t>Figure 6: Impact dashboard with lift over baselines, recall per fraud scenario and the fairness audit.</w:t>
+      </w:r>
+    </w:p>
+    <w:p>
+      <w:pPr>
+        <w:spacing w:before="120"/>
+        <w:jc w:val="center"/>
+      </w:pPr>
+      <w:r>
+        <w:rPr>
+          <w:noProof/>
+        </w:rPr>
+        <w:lastRenderedPageBreak/>
+        <w:drawing>
+          <wp:inline distT="0" distB="0" distL="0" distR="0">
+            <wp:extent cx="5715000" cy="3571875"/>
+            <wp:effectExtent l="0" t="0" r="0" b="0"/>
+            <wp:docPr id="7" name="08-admin-readonly.png" descr="Figure 7: Admin page: live policy editing, read-only until the admin password is entered." title="Figure 7: Admin page: live policy editing, read-only until the admin password is entered."/>
+            <wp:cNvGraphicFramePr>
+              <a:graphicFrameLocks xmlns:a="http://schemas.openxmlformats.org/drawingml/2006/main" noChangeAspect="1"/>
+            </wp:cNvGraphicFramePr>
+            <a:graphic xmlns:a="http://schemas.openxmlformats.org/drawingml/2006/main">
+              <a:graphicData uri="http://schemas.openxmlformats.org/drawingml/2006/picture">
+                <pic:pic xmlns:pic="http://schemas.openxmlformats.org/drawingml/2006/picture">
+                  <pic:nvPicPr>
+                    <pic:cNvPr id="0" name=""/>
+                    <pic:cNvPicPr>
+                      <a:picLocks noChangeAspect="1" noChangeArrowheads="1"/>
+                    </pic:cNvPicPr>
+                  </pic:nvPicPr>
+                  <pic:blipFill>
+                    <a:blip r:embed="rId14"/>
+                    <a:srcRect/>
+                    <a:stretch>
+                      <a:fillRect/>
+                    </a:stretch>
+                  </pic:blipFill>
+                  <pic:spPr bwMode="auto">
+                    <a:xfrm>
+                      <a:off x="0" y="0"/>
+                      <a:ext cx="5715000" cy="3571875"/>
+                    </a:xfrm>
+                    <a:prstGeom prst="rect">
+                      <a:avLst/>
+                    </a:prstGeom>
+                  </pic:spPr>
+                </pic:pic>
+              </a:graphicData>
+            </a:graphic>
+          </wp:inline>
+        </w:drawing>
+      </w:r>
+    </w:p>
+    <w:p>
+      <w:pPr>
+        <w:spacing w:before="60" w:after="200"/>
+      </w:pPr>
+      <w:r>
+        <w:rPr>
+          <w:i/>
+          <w:iCs/>
+          <w:color w:val="52514E"/>
+          <w:sz w:val="18"/>
+          <w:szCs w:val="18"/>
+        </w:rPr>
+        <w:t>Figure 7: Admin page: live policy editing, read-only until the admin password is entered.</w:t>
       </w:r>
     </w:p>
     <w:sectPr>
-      <w:headerReference w:type="default" r:id="rId8"/>
-      <w:footerReference w:type="default" r:id="rId9"/>
+      <w:headerReference w:type="default" r:id="rId15"/>
+      <w:footerReference w:type="default" r:id="rId16"/>
       <w:pgSz w:w="11906" w:h="16838"/>
       <w:pgMar w:top="1440" w:right="1440" w:bottom="1440" w:left="1440" w:header="708" w:footer="708" w:gutter="0"/>
       <w:cols w:space="720"/>
@@ -6686,7 +8535,7 @@
         <w:sz w:val="17"/>
         <w:szCs w:val="17"/>
       </w:rPr>
-      <w:t>8</w:t>
+      <w:t>15</w:t>
     </w:r>
     <w:r>
       <w:rPr>
@@ -6745,15 +8594,7 @@
         <w:szCs w:val="17"/>
       </w:rPr>
       <w:tab/>
-      <w:t>AI DEV FEST 2026 · P</w:t>
-    </w:r>
-    <w:r>
-      <w:rPr>
-        <w:color w:val="52514E"/>
-        <w:sz w:val="17"/>
-        <w:szCs w:val="17"/>
-      </w:rPr>
-      <w:t>roject Report</w:t>
+      <w:t>AI DEV FEST 2026 · Project Report</w:t>
     </w:r>
   </w:p>
 </w:hdr>
@@ -6762,10 +8603,10 @@
 <file path=word/numbering.xml><?xml version="1.0" encoding="utf-8"?>
 <w:numbering xmlns:wpc="http://schemas.microsoft.com/office/word/2010/wordprocessingCanvas" xmlns:mc="http://schemas.openxmlformats.org/markup-compatibility/2006" xmlns:o="urn:schemas-microsoft-com:office:office" xmlns:r="http://schemas.openxmlformats.org/officeDocument/2006/relationships" xmlns:m="http://schemas.openxmlformats.org/officeDocument/2006/math" xmlns:v="urn:schemas-microsoft-com:vml" xmlns:wp14="http://schemas.microsoft.com/office/word/2010/wordprocessingDrawing" xmlns:wp="http://schemas.openxmlformats.org/drawingml/2006/wordprocessingDrawing" xmlns:w10="urn:schemas-microsoft-com:office:word" xmlns:w="http://schemas.openxmlformats.org/wordprocessingml/2006/main" xmlns:w14="http://schemas.microsoft.com/office/word/2010/wordml" xmlns:wpg="http://schemas.microsoft.com/office/word/2010/wordprocessingGroup" xmlns:wpi="http://schemas.microsoft.com/office/word/2010/wordprocessingInk" xmlns:wne="http://schemas.microsoft.com/office/word/2006/wordml" xmlns:wps="http://schemas.microsoft.com/office/word/2010/wordprocessingShape" mc:Ignorable="w14 wp14">
   <w:abstractNum w:abstractNumId="0">
-    <w:nsid w:val="3416736B"/>
+    <w:nsid w:val="416329E9"/>
     <w:multiLevelType w:val="hybridMultilevel"/>
-    <w:tmpl w:val="3D3ED1D6"/>
-    <w:lvl w:ilvl="0" w:tplc="A10CDDE0">
+    <w:tmpl w:val="31E0D3BE"/>
+    <w:lvl w:ilvl="0" w:tplc="D1680D9C">
       <w:start w:val="1"/>
       <w:numFmt w:val="bullet"/>
       <w:lvlText w:val="•"/>
@@ -6774,138 +8615,52 @@
         <w:ind w:left="540" w:hanging="270"/>
       </w:pPr>
     </w:lvl>
-    <w:lvl w:ilvl="1" w:tplc="9CC4A54E">
+    <w:lvl w:ilvl="1" w:tplc="9C8A0A58">
       <w:numFmt w:val="decimal"/>
       <w:lvlText w:val=""/>
       <w:lvlJc w:val="left"/>
     </w:lvl>
-    <w:lvl w:ilvl="2" w:tplc="141E1FF4">
+    <w:lvl w:ilvl="2" w:tplc="2D5A2610">
       <w:numFmt w:val="decimal"/>
       <w:lvlText w:val=""/>
       <w:lvlJc w:val="left"/>
     </w:lvl>
-    <w:lvl w:ilvl="3" w:tplc="346443C0">
+    <w:lvl w:ilvl="3" w:tplc="95D0F234">
       <w:numFmt w:val="decimal"/>
       <w:lvlText w:val=""/>
       <w:lvlJc w:val="left"/>
     </w:lvl>
-    <w:lvl w:ilvl="4" w:tplc="8D24381E">
+    <w:lvl w:ilvl="4" w:tplc="5CFED026">
       <w:numFmt w:val="decimal"/>
       <w:lvlText w:val=""/>
       <w:lvlJc w:val="left"/>
     </w:lvl>
-    <w:lvl w:ilvl="5" w:tplc="4D56376E">
+    <w:lvl w:ilvl="5" w:tplc="FBD26D66">
       <w:numFmt w:val="decimal"/>
       <w:lvlText w:val=""/>
       <w:lvlJc w:val="left"/>
     </w:lvl>
-    <w:lvl w:ilvl="6" w:tplc="0014578C">
+    <w:lvl w:ilvl="6" w:tplc="43AEF5A4">
       <w:numFmt w:val="decimal"/>
       <w:lvlText w:val=""/>
       <w:lvlJc w:val="left"/>
     </w:lvl>
-    <w:lvl w:ilvl="7" w:tplc="1BF4AF5A">
+    <w:lvl w:ilvl="7" w:tplc="37E0F8FC">
       <w:numFmt w:val="decimal"/>
       <w:lvlText w:val=""/>
       <w:lvlJc w:val="left"/>
     </w:lvl>
-    <w:lvl w:ilvl="8" w:tplc="926EFB72">
+    <w:lvl w:ilvl="8" w:tplc="69E61480">
       <w:numFmt w:val="decimal"/>
       <w:lvlText w:val=""/>
       <w:lvlJc w:val="left"/>
     </w:lvl>
   </w:abstractNum>
   <w:abstractNum w:abstractNumId="1">
-    <w:nsid w:val="5E802B68"/>
+    <w:nsid w:val="642F2886"/>
     <w:multiLevelType w:val="hybridMultilevel"/>
-    <w:tmpl w:val="FF446C74"/>
-    <w:lvl w:ilvl="0" w:tplc="3536A4E0" w:tentative="1">
-      <w:start w:val="1"/>
-      <w:numFmt w:val="bullet"/>
-      <w:lvlText w:val="●"/>
-      <w:lvlJc w:val="left"/>
-      <w:pPr>
-        <w:ind w:left="720" w:hanging="360"/>
-      </w:pPr>
-    </w:lvl>
-    <w:lvl w:ilvl="1" w:tplc="D33064A0" w:tentative="1">
-      <w:start w:val="1"/>
-      <w:numFmt w:val="bullet"/>
-      <w:lvlText w:val="○"/>
-      <w:lvlJc w:val="left"/>
-      <w:pPr>
-        <w:ind w:left="1440" w:hanging="360"/>
-      </w:pPr>
-    </w:lvl>
-    <w:lvl w:ilvl="2" w:tplc="AA96B64A" w:tentative="1">
-      <w:start w:val="1"/>
-      <w:numFmt w:val="bullet"/>
-      <w:lvlText w:val="■"/>
-      <w:lvlJc w:val="left"/>
-      <w:pPr>
-        <w:ind w:left="2160" w:hanging="360"/>
-      </w:pPr>
-    </w:lvl>
-    <w:lvl w:ilvl="3" w:tplc="DA72C8C6" w:tentative="1">
-      <w:start w:val="1"/>
-      <w:numFmt w:val="bullet"/>
-      <w:lvlText w:val="●"/>
-      <w:lvlJc w:val="left"/>
-      <w:pPr>
-        <w:ind w:left="2880" w:hanging="360"/>
-      </w:pPr>
-    </w:lvl>
-    <w:lvl w:ilvl="4" w:tplc="CEAACD46" w:tentative="1">
-      <w:start w:val="1"/>
-      <w:numFmt w:val="bullet"/>
-      <w:lvlText w:val="○"/>
-      <w:lvlJc w:val="left"/>
-      <w:pPr>
-        <w:ind w:left="3600" w:hanging="360"/>
-      </w:pPr>
-    </w:lvl>
-    <w:lvl w:ilvl="5" w:tplc="AA24D712" w:tentative="1">
-      <w:start w:val="1"/>
-      <w:numFmt w:val="bullet"/>
-      <w:lvlText w:val="■"/>
-      <w:lvlJc w:val="left"/>
-      <w:pPr>
-        <w:ind w:left="4320" w:hanging="360"/>
-      </w:pPr>
-    </w:lvl>
-    <w:lvl w:ilvl="6" w:tplc="7BF019E0" w:tentative="1">
-      <w:start w:val="1"/>
-      <w:numFmt w:val="bullet"/>
-      <w:lvlText w:val="●"/>
-      <w:lvlJc w:val="left"/>
-      <w:pPr>
-        <w:ind w:left="5040" w:hanging="360"/>
-      </w:pPr>
-    </w:lvl>
-    <w:lvl w:ilvl="7" w:tplc="F77611DE" w:tentative="1">
-      <w:start w:val="1"/>
-      <w:numFmt w:val="bullet"/>
-      <w:lvlText w:val="●"/>
-      <w:lvlJc w:val="left"/>
-      <w:pPr>
-        <w:ind w:left="5760" w:hanging="360"/>
-      </w:pPr>
-    </w:lvl>
-    <w:lvl w:ilvl="8" w:tplc="D4D6C3C2" w:tentative="1">
-      <w:start w:val="1"/>
-      <w:numFmt w:val="bullet"/>
-      <w:lvlText w:val="●"/>
-      <w:lvlJc w:val="left"/>
-      <w:pPr>
-        <w:ind w:left="6480" w:hanging="360"/>
-      </w:pPr>
-    </w:lvl>
-  </w:abstractNum>
-  <w:abstractNum w:abstractNumId="2">
-    <w:nsid w:val="6E1F5962"/>
-    <w:multiLevelType w:val="hybridMultilevel"/>
-    <w:tmpl w:val="C0925B08"/>
-    <w:lvl w:ilvl="0" w:tplc="B77A4A84">
+    <w:tmpl w:val="CF9C0942"/>
+    <w:lvl w:ilvl="0" w:tplc="977C1202">
       <w:start w:val="1"/>
       <w:numFmt w:val="decimal"/>
       <w:lvlText w:val="%1."/>
@@ -6914,49 +8669,135 @@
         <w:ind w:left="540" w:hanging="300"/>
       </w:pPr>
     </w:lvl>
-    <w:lvl w:ilvl="1" w:tplc="30CEC55E">
+    <w:lvl w:ilvl="1" w:tplc="3CCCC952">
       <w:numFmt w:val="decimal"/>
       <w:lvlText w:val=""/>
       <w:lvlJc w:val="left"/>
     </w:lvl>
-    <w:lvl w:ilvl="2" w:tplc="3F201E78">
+    <w:lvl w:ilvl="2" w:tplc="05EA365A">
       <w:numFmt w:val="decimal"/>
       <w:lvlText w:val=""/>
       <w:lvlJc w:val="left"/>
     </w:lvl>
-    <w:lvl w:ilvl="3" w:tplc="54A6D6A4">
+    <w:lvl w:ilvl="3" w:tplc="89F02BCA">
       <w:numFmt w:val="decimal"/>
       <w:lvlText w:val=""/>
       <w:lvlJc w:val="left"/>
     </w:lvl>
-    <w:lvl w:ilvl="4" w:tplc="FDFEAE22">
+    <w:lvl w:ilvl="4" w:tplc="5C081CF4">
       <w:numFmt w:val="decimal"/>
       <w:lvlText w:val=""/>
       <w:lvlJc w:val="left"/>
     </w:lvl>
-    <w:lvl w:ilvl="5" w:tplc="FA7ABE70">
+    <w:lvl w:ilvl="5" w:tplc="FDC2A86A">
       <w:numFmt w:val="decimal"/>
       <w:lvlText w:val=""/>
       <w:lvlJc w:val="left"/>
     </w:lvl>
-    <w:lvl w:ilvl="6" w:tplc="40600D40">
+    <w:lvl w:ilvl="6" w:tplc="83468FE4">
       <w:numFmt w:val="decimal"/>
       <w:lvlText w:val=""/>
       <w:lvlJc w:val="left"/>
     </w:lvl>
-    <w:lvl w:ilvl="7" w:tplc="9B1C0E70">
+    <w:lvl w:ilvl="7" w:tplc="9D66BDC0">
       <w:numFmt w:val="decimal"/>
       <w:lvlText w:val=""/>
       <w:lvlJc w:val="left"/>
     </w:lvl>
-    <w:lvl w:ilvl="8" w:tplc="35F8B91A">
+    <w:lvl w:ilvl="8" w:tplc="100ABF2A">
       <w:numFmt w:val="decimal"/>
       <w:lvlText w:val=""/>
       <w:lvlJc w:val="left"/>
     </w:lvl>
   </w:abstractNum>
+  <w:abstractNum w:abstractNumId="2">
+    <w:nsid w:val="7B4D0831"/>
+    <w:multiLevelType w:val="hybridMultilevel"/>
+    <w:tmpl w:val="03EAA5EE"/>
+    <w:lvl w:ilvl="0" w:tplc="35E89408" w:tentative="1">
+      <w:start w:val="1"/>
+      <w:numFmt w:val="bullet"/>
+      <w:lvlText w:val="●"/>
+      <w:lvlJc w:val="left"/>
+      <w:pPr>
+        <w:ind w:left="720" w:hanging="360"/>
+      </w:pPr>
+    </w:lvl>
+    <w:lvl w:ilvl="1" w:tplc="7B9CA3CE" w:tentative="1">
+      <w:start w:val="1"/>
+      <w:numFmt w:val="bullet"/>
+      <w:lvlText w:val="○"/>
+      <w:lvlJc w:val="left"/>
+      <w:pPr>
+        <w:ind w:left="1440" w:hanging="360"/>
+      </w:pPr>
+    </w:lvl>
+    <w:lvl w:ilvl="2" w:tplc="A2E600A2" w:tentative="1">
+      <w:start w:val="1"/>
+      <w:numFmt w:val="bullet"/>
+      <w:lvlText w:val="■"/>
+      <w:lvlJc w:val="left"/>
+      <w:pPr>
+        <w:ind w:left="2160" w:hanging="360"/>
+      </w:pPr>
+    </w:lvl>
+    <w:lvl w:ilvl="3" w:tplc="A06E473A" w:tentative="1">
+      <w:start w:val="1"/>
+      <w:numFmt w:val="bullet"/>
+      <w:lvlText w:val="●"/>
+      <w:lvlJc w:val="left"/>
+      <w:pPr>
+        <w:ind w:left="2880" w:hanging="360"/>
+      </w:pPr>
+    </w:lvl>
+    <w:lvl w:ilvl="4" w:tplc="E0C45E56" w:tentative="1">
+      <w:start w:val="1"/>
+      <w:numFmt w:val="bullet"/>
+      <w:lvlText w:val="○"/>
+      <w:lvlJc w:val="left"/>
+      <w:pPr>
+        <w:ind w:left="3600" w:hanging="360"/>
+      </w:pPr>
+    </w:lvl>
+    <w:lvl w:ilvl="5" w:tplc="68B2DCC4" w:tentative="1">
+      <w:start w:val="1"/>
+      <w:numFmt w:val="bullet"/>
+      <w:lvlText w:val="■"/>
+      <w:lvlJc w:val="left"/>
+      <w:pPr>
+        <w:ind w:left="4320" w:hanging="360"/>
+      </w:pPr>
+    </w:lvl>
+    <w:lvl w:ilvl="6" w:tplc="F7CE65B0" w:tentative="1">
+      <w:start w:val="1"/>
+      <w:numFmt w:val="bullet"/>
+      <w:lvlText w:val="●"/>
+      <w:lvlJc w:val="left"/>
+      <w:pPr>
+        <w:ind w:left="5040" w:hanging="360"/>
+      </w:pPr>
+    </w:lvl>
+    <w:lvl w:ilvl="7" w:tplc="880CCC14" w:tentative="1">
+      <w:start w:val="1"/>
+      <w:numFmt w:val="bullet"/>
+      <w:lvlText w:val="●"/>
+      <w:lvlJc w:val="left"/>
+      <w:pPr>
+        <w:ind w:left="5760" w:hanging="360"/>
+      </w:pPr>
+    </w:lvl>
+    <w:lvl w:ilvl="8" w:tplc="972A9E0A" w:tentative="1">
+      <w:start w:val="1"/>
+      <w:numFmt w:val="bullet"/>
+      <w:lvlText w:val="●"/>
+      <w:lvlJc w:val="left"/>
+      <w:pPr>
+        <w:ind w:left="6480" w:hanging="360"/>
+      </w:pPr>
+    </w:lvl>
+  </w:abstractNum>
   <w:num w:numId="1">
-    <w:abstractNumId w:val="1"/>
+    <w:abstractNumId w:val="2"/>
     <w:lvlOverride w:ilvl="0">
       <w:startOverride w:val="1"/>
     </w:lvlOverride>
@@ -6968,7 +8809,7 @@
     </w:lvlOverride>
   </w:num>
   <w:num w:numId="3">
-    <w:abstractNumId w:val="2"/>
+    <w:abstractNumId w:val="1"/>
     <w:lvlOverride w:ilvl="0">
       <w:startOverride w:val="1"/>
     </w:lvlOverride>
@@ -7352,7 +9193,7 @@
     <w:autoRedefine/>
     <w:uiPriority w:val="39"/>
     <w:unhideWhenUsed/>
-    <w:rsid w:val="00E60B76"/>
+    <w:rsid w:val="00CE6BB0"/>
     <w:pPr>
       <w:spacing w:after="100"/>
     </w:pPr>
@@ -7364,7 +9205,7 @@
     <w:autoRedefine/>
     <w:uiPriority w:val="39"/>
     <w:unhideWhenUsed/>
-    <w:rsid w:val="00E60B76"/>
+    <w:rsid w:val="00CE6BB0"/>
     <w:pPr>
       <w:spacing w:after="100"/>
       <w:ind w:left="220"/>
@@ -7749,7 +9590,7 @@
     <w:autoRedefine/>
     <w:uiPriority w:val="39"/>
     <w:unhideWhenUsed/>
-    <w:rsid w:val="00E60B76"/>
+    <w:rsid w:val="00CE6BB0"/>
     <w:pPr>
       <w:spacing w:after="100"/>
     </w:pPr>
@@ -7761,7 +9602,7 @@
     <w:autoRedefine/>
     <w:uiPriority w:val="39"/>
     <w:unhideWhenUsed/>
-    <w:rsid w:val="00E60B76"/>
+    <w:rsid w:val="00CE6BB0"/>
     <w:pPr>
       <w:spacing w:after="100"/>
       <w:ind w:left="220"/>

</xml_diff>